<commit_message>
Added new answers for analysis
</commit_message>
<xml_diff>
--- a/DataFrames Good to Know/Info/experiences.docx
+++ b/DataFrames Good to Know/Info/experiences.docx
@@ -10,11 +10,16 @@
           <w:numId w:val="8"/>
         </w:numPr>
       </w:pPr>
+      <w:proofErr w:type="spellStart"/>
       <w:r>
         <w:t>f</w:t>
       </w:r>
       <w:r>
-        <w:t>AB test</w:t>
+        <w:t>AB</w:t>
+      </w:r>
+      <w:proofErr w:type="spellEnd"/>
+      <w:r>
+        <w:t xml:space="preserve"> test</w:t>
       </w:r>
     </w:p>
     <w:p>
@@ -44,7 +49,15 @@
         <w:t>Logistics Regression</w:t>
       </w:r>
       <w:r>
-        <w:t xml:space="preserve"> with usage of softmax functions</w:t>
+        <w:t xml:space="preserve"> with usage of </w:t>
+      </w:r>
+      <w:proofErr w:type="spellStart"/>
+      <w:r>
+        <w:t>softmax</w:t>
+      </w:r>
+      <w:proofErr w:type="spellEnd"/>
+      <w:r>
+        <w:t xml:space="preserve"> functions</w:t>
       </w:r>
     </w:p>
     <w:p>
@@ -256,9 +269,11 @@
       <w:r>
         <w:t xml:space="preserve"> </w:t>
       </w:r>
+      <w:proofErr w:type="spellStart"/>
       <w:r>
         <w:t>ChannelAttribution</w:t>
       </w:r>
+      <w:proofErr w:type="spellEnd"/>
     </w:p>
     <w:p>
       <w:pPr>
@@ -409,7 +424,15 @@
         <w:t xml:space="preserve"> f(x – x</w:t>
       </w:r>
       <w:r>
-        <w:t xml:space="preserve"> (i) </w:t>
+        <w:t xml:space="preserve"> (</w:t>
+      </w:r>
+      <w:proofErr w:type="spellStart"/>
+      <w:r>
+        <w:t>i</w:t>
+      </w:r>
+      <w:proofErr w:type="spellEnd"/>
+      <w:r>
+        <w:t xml:space="preserve">) </w:t>
       </w:r>
       <w:r>
         <w:t>)^2 / N</w:t>
@@ -450,7 +473,15 @@
         <w:t>Σ</w:t>
       </w:r>
       <w:r>
-        <w:t xml:space="preserve"> f(x – x(i)) ^ 4 / N</w:t>
+        <w:t xml:space="preserve"> f(x – x(</w:t>
+      </w:r>
+      <w:proofErr w:type="spellStart"/>
+      <w:r>
+        <w:t>i</w:t>
+      </w:r>
+      <w:proofErr w:type="spellEnd"/>
+      <w:r>
+        <w:t>)) ^ 4 / N</w:t>
       </w:r>
     </w:p>
     <w:p>
@@ -571,10 +602,23 @@
     </w:p>
     <w:p>
       <w:r>
-        <w:t xml:space="preserve">P(X) = nCx * </w:t>
-      </w:r>
-      <w:r>
-        <w:t>p^x * q^(n-x)</w:t>
+        <w:t xml:space="preserve">P(X) = </w:t>
+      </w:r>
+      <w:proofErr w:type="spellStart"/>
+      <w:r>
+        <w:t>nCx</w:t>
+      </w:r>
+      <w:proofErr w:type="spellEnd"/>
+      <w:r>
+        <w:t xml:space="preserve"> * </w:t>
+      </w:r>
+      <w:proofErr w:type="spellStart"/>
+      <w:r>
+        <w:t>p^x</w:t>
+      </w:r>
+      <w:proofErr w:type="spellEnd"/>
+      <w:r>
+        <w:t xml:space="preserve"> * q^(n-x)</w:t>
       </w:r>
     </w:p>
     <w:p>
@@ -584,8 +628,13 @@
     </w:p>
     <w:p>
       <w:r>
-        <w:t>Variance = E(x^2) – E(x)^2 = npq</w:t>
-      </w:r>
+        <w:t xml:space="preserve">Variance = E(x^2) – E(x)^2 = </w:t>
+      </w:r>
+      <w:proofErr w:type="spellStart"/>
+      <w:r>
+        <w:t>npq</w:t>
+      </w:r>
+      <w:proofErr w:type="spellEnd"/>
     </w:p>
     <w:p/>
     <w:p>
@@ -1089,6 +1138,7 @@
       <w:r>
         <w:t> events to occur in time </w:t>
       </w:r>
+      <w:proofErr w:type="spellStart"/>
       <w:r>
         <w:rPr>
           <w:b/>
@@ -1096,7 +1146,17 @@
           <w:i/>
           <w:iCs/>
         </w:rPr>
-        <w:t>t:</w:t>
+        <w:t>t</w:t>
+      </w:r>
+      <w:proofErr w:type="spellEnd"/>
+      <w:r>
+        <w:rPr>
+          <w:b/>
+          <w:bCs/>
+          <w:i/>
+          <w:iCs/>
+        </w:rPr>
+        <w:t>:</w:t>
       </w:r>
     </w:p>
     <w:p>
@@ -1304,7 +1364,15 @@
         <w:t>t</w:t>
       </w:r>
       <w:r>
-        <w:t> as thats the random variable.</w:t>
+        <w:t xml:space="preserve"> as </w:t>
+      </w:r>
+      <w:proofErr w:type="spellStart"/>
+      <w:r>
+        <w:t>thats</w:t>
+      </w:r>
+      <w:proofErr w:type="spellEnd"/>
+      <w:r>
+        <w:t xml:space="preserve"> the random variable.</w:t>
       </w:r>
     </w:p>
     <w:p>
@@ -1505,15 +1573,32 @@
     <w:p/>
     <w:p/>
     <w:p>
-      <w:r>
-        <w:rPr>
-          <w:b/>
-          <w:bCs/>
-        </w:rPr>
-        <w:t>Bernouli Distribution:</w:t>
-      </w:r>
-      <w:r>
-        <w:t xml:space="preserve"> In Bernouli distribution there is only one trial</w:t>
+      <w:proofErr w:type="spellStart"/>
+      <w:r>
+        <w:rPr>
+          <w:b/>
+          <w:bCs/>
+        </w:rPr>
+        <w:t>Bernouli</w:t>
+      </w:r>
+      <w:proofErr w:type="spellEnd"/>
+      <w:r>
+        <w:rPr>
+          <w:b/>
+          <w:bCs/>
+        </w:rPr>
+        <w:t xml:space="preserve"> Distribution:</w:t>
+      </w:r>
+      <w:r>
+        <w:t xml:space="preserve"> In </w:t>
+      </w:r>
+      <w:proofErr w:type="spellStart"/>
+      <w:r>
+        <w:t>Bernouli</w:t>
+      </w:r>
+      <w:proofErr w:type="spellEnd"/>
+      <w:r>
+        <w:t xml:space="preserve"> distribution there is only one trial</w:t>
       </w:r>
     </w:p>
     <w:p>
@@ -1970,7 +2055,7 @@
           <w:noProof/>
         </w:rPr>
         <w:drawing>
-          <wp:inline distT="0" distB="0" distL="0" distR="0" wp14:anchorId="1C0A4047" wp14:editId="230406F3">
+          <wp:inline distT="0" distB="0" distL="0" distR="0" wp14:anchorId="1C0A4047" wp14:editId="1B24AE3D">
             <wp:extent cx="2910177" cy="1588571"/>
             <wp:effectExtent l="0" t="0" r="0" b="0"/>
             <wp:docPr id="1466350806" name="Picture 20" descr="Plot generated by author in Python."/>
@@ -2041,7 +2126,7 @@
         </w:rPr>
         <w:lastRenderedPageBreak/>
         <w:drawing>
-          <wp:inline distT="0" distB="0" distL="0" distR="0" wp14:anchorId="339436E1" wp14:editId="10FBB2B8">
+          <wp:inline distT="0" distB="0" distL="0" distR="0" wp14:anchorId="339436E1" wp14:editId="200C83B0">
             <wp:extent cx="3156668" cy="1723122"/>
             <wp:effectExtent l="0" t="0" r="0" b="0"/>
             <wp:docPr id="1824401839" name="Picture 21" descr="Plot generated by author in Python."/>
@@ -2432,7 +2517,23 @@
       </w:pPr>
       <w:r>
         <w:lastRenderedPageBreak/>
-        <w:t>Stratified Sampling – The population is divided in stratas which are homogenous inside and heterogenous outside and we extract some samples for each stratas so that their ratio resembles the population</w:t>
+        <w:t xml:space="preserve">Stratified Sampling – The population is divided in </w:t>
+      </w:r>
+      <w:proofErr w:type="spellStart"/>
+      <w:r>
+        <w:t>stratas</w:t>
+      </w:r>
+      <w:proofErr w:type="spellEnd"/>
+      <w:r>
+        <w:t xml:space="preserve"> which are homogenous inside and heterogenous outside and we extract some samples for each </w:t>
+      </w:r>
+      <w:proofErr w:type="spellStart"/>
+      <w:r>
+        <w:t>stratas</w:t>
+      </w:r>
+      <w:proofErr w:type="spellEnd"/>
+      <w:r>
+        <w:t xml:space="preserve"> so that their ratio resembles the population</w:t>
       </w:r>
     </w:p>
     <w:p>
@@ -3522,9 +3623,252 @@
       </w:r>
     </w:p>
     <w:p/>
+    <w:p>
+      <w:r>
+        <w:t xml:space="preserve">For a specific uplift the difference between mean only tells you whether test is significantly different from control. If you want to test whether the test causes an uplift of 15% you need to run another test. </w:t>
+      </w:r>
+    </w:p>
+    <w:p>
+      <w:r>
+        <w:t>Null Hypothesis</w:t>
+      </w:r>
+      <w:r>
+        <w:t xml:space="preserve">: </w:t>
+      </w:r>
+      <w:r>
+        <w:t>Lift</w:t>
+      </w:r>
+      <w:r>
+        <w:t xml:space="preserve"> &lt;</w:t>
+      </w:r>
+      <w:r>
+        <w:t xml:space="preserve"> 0.06</w:t>
+      </w:r>
+    </w:p>
+    <w:p>
+      <w:r>
+        <w:t>Alternative Hypothesis: Lift &gt; 0.06</w:t>
+      </w:r>
+    </w:p>
+    <w:p>
+      <w:r>
+        <w:t xml:space="preserve">You are not asking: </w:t>
+      </w:r>
+      <w:r>
+        <w:rPr>
+          <w:i/>
+          <w:iCs/>
+        </w:rPr>
+        <w:t>"Is the test different from the control?"</w:t>
+      </w:r>
+      <w:r>
+        <w:t xml:space="preserve"> You are specifically asking: </w:t>
+      </w:r>
+      <w:r>
+        <w:rPr>
+          <w:i/>
+          <w:iCs/>
+        </w:rPr>
+        <w:t xml:space="preserve">"Is the test </w:t>
+      </w:r>
+      <w:r>
+        <w:rPr>
+          <w:b/>
+          <w:bCs/>
+          <w:i/>
+          <w:iCs/>
+        </w:rPr>
+        <w:t>at least 6% better</w:t>
+      </w:r>
+      <w:r>
+        <w:rPr>
+          <w:i/>
+          <w:iCs/>
+        </w:rPr>
+        <w:t xml:space="preserve"> than the control?"</w:t>
+      </w:r>
+      <w:r>
+        <w:t xml:space="preserve"> Because you are exclusively interested in the upper tail of the distribution (values greater than 0.06), you direct your entire $\alpha$ (significance level, e.g., 0.05) into that single tail.</w:t>
+      </w:r>
+    </w:p>
     <w:p/>
     <w:p>
       <w:r>
+        <w:drawing>
+          <wp:inline distT="0" distB="0" distL="0" distR="0" wp14:anchorId="52A0AF6C" wp14:editId="109EC590">
+            <wp:extent cx="5731510" cy="917575"/>
+            <wp:effectExtent l="0" t="0" r="2540" b="0"/>
+            <wp:docPr id="1478618165" name="Picture 1"/>
+            <wp:cNvGraphicFramePr>
+              <a:graphicFrameLocks xmlns:a="http://schemas.openxmlformats.org/drawingml/2006/main" noChangeAspect="1"/>
+            </wp:cNvGraphicFramePr>
+            <a:graphic xmlns:a="http://schemas.openxmlformats.org/drawingml/2006/main">
+              <a:graphicData uri="http://schemas.openxmlformats.org/drawingml/2006/picture">
+                <pic:pic xmlns:pic="http://schemas.openxmlformats.org/drawingml/2006/picture">
+                  <pic:nvPicPr>
+                    <pic:cNvPr id="1478618165" name=""/>
+                    <pic:cNvPicPr/>
+                  </pic:nvPicPr>
+                  <pic:blipFill>
+                    <a:blip r:embed="rId31"/>
+                    <a:stretch>
+                      <a:fillRect/>
+                    </a:stretch>
+                  </pic:blipFill>
+                  <pic:spPr>
+                    <a:xfrm>
+                      <a:off x="0" y="0"/>
+                      <a:ext cx="5731510" cy="917575"/>
+                    </a:xfrm>
+                    <a:prstGeom prst="rect">
+                      <a:avLst/>
+                    </a:prstGeom>
+                  </pic:spPr>
+                </pic:pic>
+              </a:graphicData>
+            </a:graphic>
+          </wp:inline>
+        </w:drawing>
+      </w:r>
+    </w:p>
+    <w:p>
+      <w:r>
+        <w:t>Since under null hypothesis variance of test and control will be equal and will be equal to totals variance</w:t>
+      </w:r>
+    </w:p>
+    <w:p>
+      <w:r>
+        <w:drawing>
+          <wp:inline distT="0" distB="0" distL="0" distR="0" wp14:anchorId="14640293" wp14:editId="5BC38FDA">
+            <wp:extent cx="3391074" cy="971600"/>
+            <wp:effectExtent l="0" t="0" r="0" b="0"/>
+            <wp:docPr id="2096583648" name="Picture 1"/>
+            <wp:cNvGraphicFramePr>
+              <a:graphicFrameLocks xmlns:a="http://schemas.openxmlformats.org/drawingml/2006/main" noChangeAspect="1"/>
+            </wp:cNvGraphicFramePr>
+            <a:graphic xmlns:a="http://schemas.openxmlformats.org/drawingml/2006/main">
+              <a:graphicData uri="http://schemas.openxmlformats.org/drawingml/2006/picture">
+                <pic:pic xmlns:pic="http://schemas.openxmlformats.org/drawingml/2006/picture">
+                  <pic:nvPicPr>
+                    <pic:cNvPr id="2096583648" name=""/>
+                    <pic:cNvPicPr/>
+                  </pic:nvPicPr>
+                  <pic:blipFill>
+                    <a:blip r:embed="rId32"/>
+                    <a:stretch>
+                      <a:fillRect/>
+                    </a:stretch>
+                  </pic:blipFill>
+                  <pic:spPr>
+                    <a:xfrm>
+                      <a:off x="0" y="0"/>
+                      <a:ext cx="3391074" cy="971600"/>
+                    </a:xfrm>
+                    <a:prstGeom prst="rect">
+                      <a:avLst/>
+                    </a:prstGeom>
+                  </pic:spPr>
+                </pic:pic>
+              </a:graphicData>
+            </a:graphic>
+          </wp:inline>
+        </w:drawing>
+      </w:r>
+    </w:p>
+    <w:p>
+      <w:r>
+        <w:lastRenderedPageBreak/>
+        <w:drawing>
+          <wp:inline distT="0" distB="0" distL="0" distR="0" wp14:anchorId="2F9CA555" wp14:editId="277F7AC2">
+            <wp:extent cx="4445228" cy="692186"/>
+            <wp:effectExtent l="0" t="0" r="0" b="0"/>
+            <wp:docPr id="79472013" name="Picture 1"/>
+            <wp:cNvGraphicFramePr>
+              <a:graphicFrameLocks xmlns:a="http://schemas.openxmlformats.org/drawingml/2006/main" noChangeAspect="1"/>
+            </wp:cNvGraphicFramePr>
+            <a:graphic xmlns:a="http://schemas.openxmlformats.org/drawingml/2006/main">
+              <a:graphicData uri="http://schemas.openxmlformats.org/drawingml/2006/picture">
+                <pic:pic xmlns:pic="http://schemas.openxmlformats.org/drawingml/2006/picture">
+                  <pic:nvPicPr>
+                    <pic:cNvPr id="79472013" name=""/>
+                    <pic:cNvPicPr/>
+                  </pic:nvPicPr>
+                  <pic:blipFill>
+                    <a:blip r:embed="rId33"/>
+                    <a:stretch>
+                      <a:fillRect/>
+                    </a:stretch>
+                  </pic:blipFill>
+                  <pic:spPr>
+                    <a:xfrm>
+                      <a:off x="0" y="0"/>
+                      <a:ext cx="4445228" cy="692186"/>
+                    </a:xfrm>
+                    <a:prstGeom prst="rect">
+                      <a:avLst/>
+                    </a:prstGeom>
+                  </pic:spPr>
+                </pic:pic>
+              </a:graphicData>
+            </a:graphic>
+          </wp:inline>
+        </w:drawing>
+      </w:r>
+    </w:p>
+    <w:p>
+      <w:r>
+        <w:t>Observed = Conversion of Test</w:t>
+      </w:r>
+    </w:p>
+    <w:p>
+      <w:r>
+        <w:t xml:space="preserve">Expected = Conversion of Control + 0.15 * conversion of control </w:t>
+      </w:r>
+    </w:p>
+    <w:p>
+      <w:r>
+        <w:drawing>
+          <wp:inline distT="0" distB="0" distL="0" distR="0" wp14:anchorId="57BDA9DA" wp14:editId="2229E7DD">
+            <wp:extent cx="2400423" cy="692186"/>
+            <wp:effectExtent l="0" t="0" r="0" b="0"/>
+            <wp:docPr id="1998974472" name="Picture 1"/>
+            <wp:cNvGraphicFramePr>
+              <a:graphicFrameLocks xmlns:a="http://schemas.openxmlformats.org/drawingml/2006/main" noChangeAspect="1"/>
+            </wp:cNvGraphicFramePr>
+            <a:graphic xmlns:a="http://schemas.openxmlformats.org/drawingml/2006/main">
+              <a:graphicData uri="http://schemas.openxmlformats.org/drawingml/2006/picture">
+                <pic:pic xmlns:pic="http://schemas.openxmlformats.org/drawingml/2006/picture">
+                  <pic:nvPicPr>
+                    <pic:cNvPr id="1998974472" name=""/>
+                    <pic:cNvPicPr/>
+                  </pic:nvPicPr>
+                  <pic:blipFill>
+                    <a:blip r:embed="rId34"/>
+                    <a:stretch>
+                      <a:fillRect/>
+                    </a:stretch>
+                  </pic:blipFill>
+                  <pic:spPr>
+                    <a:xfrm>
+                      <a:off x="0" y="0"/>
+                      <a:ext cx="2400423" cy="692186"/>
+                    </a:xfrm>
+                    <a:prstGeom prst="rect">
+                      <a:avLst/>
+                    </a:prstGeom>
+                  </pic:spPr>
+                </pic:pic>
+              </a:graphicData>
+            </a:graphic>
+          </wp:inline>
+        </w:drawing>
+      </w:r>
+    </w:p>
+    <w:p/>
+    <w:p/>
+    <w:p/>
+    <w:p>
+      <w:r>
         <w:rPr>
           <w:b/>
           <w:bCs/>
@@ -3594,8 +3938,21 @@
         <w:t>Correlation</w:t>
       </w:r>
       <w:r>
-        <w:t xml:space="preserve"> – Conrrelation is used to find the degree of association between two independent numerics</w:t>
-      </w:r>
+        <w:t xml:space="preserve"> – </w:t>
+      </w:r>
+      <w:proofErr w:type="spellStart"/>
+      <w:r>
+        <w:t>Conrrelation</w:t>
+      </w:r>
+      <w:proofErr w:type="spellEnd"/>
+      <w:r>
+        <w:t xml:space="preserve"> is used to find the degree of association between two independent </w:t>
+      </w:r>
+      <w:proofErr w:type="spellStart"/>
+      <w:r>
+        <w:t>numerics</w:t>
+      </w:r>
+      <w:proofErr w:type="spellEnd"/>
     </w:p>
     <w:p>
       <w:pPr>
@@ -3656,7 +4013,7 @@
                     </pic:cNvPicPr>
                   </pic:nvPicPr>
                   <pic:blipFill>
-                    <a:blip r:embed="rId31" cstate="print">
+                    <a:blip r:embed="rId35" cstate="print">
                       <a:extLst>
                         <a:ext uri="{28A0092B-C50C-407E-A947-70E740481C1C}">
                           <a14:useLocalDpi xmlns:a14="http://schemas.microsoft.com/office/drawing/2010/main" val="0"/>
@@ -3705,12 +4062,26 @@
         <w:t>Σ</w:t>
       </w:r>
       <w:r>
-        <w:t xml:space="preserve"> (Zx * Zy / N)</w:t>
-      </w:r>
-    </w:p>
-    <w:p>
-      <w:r>
-        <w:t xml:space="preserve">Zx = (X1 – U1 / SD1) </w:t>
+        <w:t xml:space="preserve"> (</w:t>
+      </w:r>
+      <w:proofErr w:type="spellStart"/>
+      <w:r>
+        <w:t>Zx</w:t>
+      </w:r>
+      <w:proofErr w:type="spellEnd"/>
+      <w:r>
+        <w:t xml:space="preserve"> * Zy / N)</w:t>
+      </w:r>
+    </w:p>
+    <w:p>
+      <w:proofErr w:type="spellStart"/>
+      <w:r>
+        <w:lastRenderedPageBreak/>
+        <w:t>Zx</w:t>
+      </w:r>
+      <w:proofErr w:type="spellEnd"/>
+      <w:r>
+        <w:t xml:space="preserve"> = (X1 – U1 / SD1) </w:t>
       </w:r>
     </w:p>
     <w:p>
@@ -3891,34 +4262,58 @@
     </w:p>
     <w:p>
       <w:r>
+        <w:t>Y(n + 1) = Y(n) – PF for loss function F(Y(n)) * learning rate</w:t>
+      </w:r>
+    </w:p>
+    <w:p>
+      <w:r>
+        <w:t xml:space="preserve"> For GD, the loss function </w:t>
+      </w:r>
+      <w:proofErr w:type="spellStart"/>
+      <w:r>
+        <w:t>function</w:t>
+      </w:r>
+      <w:proofErr w:type="spellEnd"/>
+      <w:r>
+        <w:t xml:space="preserve"> consists of the entire data set while for SGD, the loss function </w:t>
+      </w:r>
+      <w:proofErr w:type="spellStart"/>
+      <w:r>
+        <w:t>function</w:t>
+      </w:r>
+      <w:proofErr w:type="spellEnd"/>
+      <w:r>
+        <w:t xml:space="preserve"> consists of one random entry or a batch of random entries</w:t>
+      </w:r>
+    </w:p>
+    <w:p/>
+    <w:p>
+      <w:pPr>
+        <w:rPr>
+          <w:b/>
+          <w:bCs/>
+        </w:rPr>
+      </w:pPr>
+      <w:r>
+        <w:rPr>
+          <w:b/>
+          <w:bCs/>
+        </w:rPr>
         <w:lastRenderedPageBreak/>
-        <w:t>Y(n + 1) = Y(n) – PF for loss function F(Y(n)) * learning rate</w:t>
-      </w:r>
-    </w:p>
-    <w:p>
-      <w:r>
-        <w:t xml:space="preserve"> For GD, the loss function function consists of the entire data set while for SGD, the loss function function consists of one random entry or a batch of random entries</w:t>
-      </w:r>
-    </w:p>
-    <w:p/>
-    <w:p>
-      <w:pPr>
-        <w:rPr>
-          <w:b/>
-          <w:bCs/>
-        </w:rPr>
-      </w:pPr>
-      <w:r>
-        <w:rPr>
-          <w:b/>
-          <w:bCs/>
-        </w:rPr>
         <w:t xml:space="preserve">Gradient Descent: </w:t>
       </w:r>
     </w:p>
     <w:p>
       <w:r>
-        <w:t>Regression equation Y = aX + b</w:t>
+        <w:t xml:space="preserve">Regression equation Y = </w:t>
+      </w:r>
+      <w:proofErr w:type="spellStart"/>
+      <w:r>
+        <w:t>aX</w:t>
+      </w:r>
+      <w:proofErr w:type="spellEnd"/>
+      <w:r>
+        <w:t xml:space="preserve"> + b</w:t>
       </w:r>
     </w:p>
     <w:p>
@@ -3950,7 +4345,15 @@
         <w:t>Σ</w:t>
       </w:r>
       <w:r>
-        <w:t xml:space="preserve"> (y1 – aX – b) ^ 2</w:t>
+        <w:t xml:space="preserve"> (y1 – </w:t>
+      </w:r>
+      <w:proofErr w:type="spellStart"/>
+      <w:r>
+        <w:t>aX</w:t>
+      </w:r>
+      <w:proofErr w:type="spellEnd"/>
+      <w:r>
+        <w:t xml:space="preserve"> – b) ^ 2</w:t>
       </w:r>
     </w:p>
     <w:p>
@@ -4064,7 +4467,23 @@
         <w:t>Σ</w:t>
       </w:r>
       <w:r>
-        <w:t xml:space="preserve"> (y(i) – y(predicted))/ (y(i) – y(mean)</w:t>
+        <w:t xml:space="preserve"> (y(</w:t>
+      </w:r>
+      <w:proofErr w:type="spellStart"/>
+      <w:r>
+        <w:t>i</w:t>
+      </w:r>
+      <w:proofErr w:type="spellEnd"/>
+      <w:r>
+        <w:t>) – y(predicted))/ (y(</w:t>
+      </w:r>
+      <w:proofErr w:type="spellStart"/>
+      <w:r>
+        <w:t>i</w:t>
+      </w:r>
+      <w:proofErr w:type="spellEnd"/>
+      <w:r>
+        <w:t>) – y(mean)</w:t>
       </w:r>
     </w:p>
     <w:p>
@@ -4236,7 +4655,7 @@
                     </pic:cNvPicPr>
                   </pic:nvPicPr>
                   <pic:blipFill>
-                    <a:blip r:embed="rId32">
+                    <a:blip r:embed="rId36">
                       <a:extLst>
                         <a:ext uri="{28A0092B-C50C-407E-A947-70E740481C1C}">
                           <a14:useLocalDpi xmlns:a14="http://schemas.microsoft.com/office/drawing/2010/main" val="0"/>
@@ -5144,12 +5563,14 @@
             </m:ctrlPr>
           </m:sSubPr>
           <m:e>
+            <w:proofErr w:type="spellStart"/>
             <m:r>
               <m:rPr>
                 <m:nor/>
               </m:rPr>
               <m:t>df</m:t>
             </m:r>
+            <w:proofErr w:type="spellEnd"/>
           </m:e>
           <m:sub>
             <m:r>
@@ -5228,12 +5649,14 @@
             </m:ctrlPr>
           </m:sSubPr>
           <m:e>
+            <w:proofErr w:type="spellStart"/>
             <m:r>
               <m:rPr>
                 <m:nor/>
               </m:rPr>
               <m:t>df</m:t>
             </m:r>
+            <w:proofErr w:type="spellEnd"/>
           </m:e>
           <m:sub>
             <m:r>
@@ -5553,7 +5976,23 @@
     </w:p>
     <w:p>
       <w:r>
-        <w:t xml:space="preserve">Proof – If hyperplane is ax + b = 0, then support vector is ax + c = 0 since support vector and hyper plane are parallel to each other. </w:t>
+        <w:t xml:space="preserve">Proof – If hyperplane is </w:t>
+      </w:r>
+      <w:proofErr w:type="spellStart"/>
+      <w:r>
+        <w:t>ax</w:t>
+      </w:r>
+      <w:proofErr w:type="spellEnd"/>
+      <w:r>
+        <w:t xml:space="preserve"> + b = 0, then support vector is </w:t>
+      </w:r>
+      <w:proofErr w:type="spellStart"/>
+      <w:r>
+        <w:t>ax</w:t>
+      </w:r>
+      <w:proofErr w:type="spellEnd"/>
+      <w:r>
+        <w:t xml:space="preserve"> + c = 0 since support vector and hyper plane are parallel to each other. </w:t>
       </w:r>
     </w:p>
     <w:p>
@@ -5584,7 +6023,15 @@
     </w:p>
     <w:p>
       <w:r>
-        <w:t>Support vectors are inherently linear classifiers and thus do not work well with non linear data.</w:t>
+        <w:t xml:space="preserve">Support vectors are inherently linear classifiers and thus do not work well with </w:t>
+      </w:r>
+      <w:proofErr w:type="spellStart"/>
+      <w:r>
+        <w:t>non linear</w:t>
+      </w:r>
+      <w:proofErr w:type="spellEnd"/>
+      <w:r>
+        <w:t xml:space="preserve"> data.</w:t>
       </w:r>
     </w:p>
     <w:p>
@@ -5904,7 +6351,7 @@
                     </pic:cNvPicPr>
                   </pic:nvPicPr>
                   <pic:blipFill>
-                    <a:blip r:embed="rId33">
+                    <a:blip r:embed="rId37">
                       <a:extLst>
                         <a:ext uri="{28A0092B-C50C-407E-A947-70E740481C1C}">
                           <a14:useLocalDpi xmlns:a14="http://schemas.microsoft.com/office/drawing/2010/main" val="0"/>
@@ -5993,7 +6440,23 @@
           <w:b/>
           <w:bCs/>
         </w:rPr>
-        <w:t>Accuracy can be mislead in imbalanced data sets</w:t>
+        <w:t xml:space="preserve">Accuracy can be </w:t>
+      </w:r>
+      <w:proofErr w:type="spellStart"/>
+      <w:r>
+        <w:rPr>
+          <w:b/>
+          <w:bCs/>
+        </w:rPr>
+        <w:t>mislead</w:t>
+      </w:r>
+      <w:proofErr w:type="spellEnd"/>
+      <w:r>
+        <w:rPr>
+          <w:b/>
+          <w:bCs/>
+        </w:rPr>
+        <w:t xml:space="preserve"> in imbalanced data sets</w:t>
       </w:r>
       <w:r>
         <w:rPr>
@@ -6024,9 +6487,11 @@
       <w:r>
         <w:t xml:space="preserve"> which consists of True Positive Rate (Recall) and False Positive Rate (1 – Specificity). The Area under ROC curve is </w:t>
       </w:r>
+      <w:proofErr w:type="spellStart"/>
       <w:r>
         <w:t>know</w:t>
       </w:r>
+      <w:proofErr w:type="spellEnd"/>
       <w:r>
         <w:t xml:space="preserve"> as AUC or the area under the curve.</w:t>
       </w:r>
@@ -6048,7 +6513,15 @@
     </w:p>
     <w:p>
       <w:r>
-        <w:t>False Positive rate is False positive of all Falses which FP / (FP + TN)</w:t>
+        <w:t xml:space="preserve">False Positive rate is False positive of all </w:t>
+      </w:r>
+      <w:proofErr w:type="spellStart"/>
+      <w:r>
+        <w:t>Falses</w:t>
+      </w:r>
+      <w:proofErr w:type="spellEnd"/>
+      <w:r>
+        <w:t xml:space="preserve"> which FP / (FP + TN)</w:t>
       </w:r>
     </w:p>
     <w:p/>
@@ -6075,7 +6548,7 @@
                     </pic:cNvPicPr>
                   </pic:nvPicPr>
                   <pic:blipFill>
-                    <a:blip r:embed="rId34" cstate="print">
+                    <a:blip r:embed="rId38" cstate="print">
                       <a:extLst>
                         <a:ext uri="{28A0092B-C50C-407E-A947-70E740481C1C}">
                           <a14:useLocalDpi xmlns:a14="http://schemas.microsoft.com/office/drawing/2010/main" val="0"/>
@@ -6162,58 +6635,248 @@
           <w:iCs/>
           <w:color w:val="4472C4" w:themeColor="accent1"/>
         </w:rPr>
-        <w:t xml:space="preserve"># Instead of: y_pred = model.predict(x_test) </w:t>
-      </w:r>
-    </w:p>
-    <w:p>
-      <w:pPr>
+        <w:t xml:space="preserve"># Instead of: </w:t>
+      </w:r>
+      <w:proofErr w:type="spellStart"/>
+      <w:r>
         <w:rPr>
           <w:i/>
           <w:iCs/>
           <w:color w:val="4472C4" w:themeColor="accent1"/>
         </w:rPr>
-      </w:pPr>
+        <w:t>y_pred</w:t>
+      </w:r>
+      <w:proofErr w:type="spellEnd"/>
       <w:r>
         <w:rPr>
           <w:i/>
           <w:iCs/>
           <w:color w:val="4472C4" w:themeColor="accent1"/>
         </w:rPr>
-        <w:t xml:space="preserve"># Use your custom threshold: custom_threshold = 0.35 </w:t>
-      </w:r>
-    </w:p>
-    <w:p>
-      <w:pPr>
+        <w:t xml:space="preserve"> = </w:t>
+      </w:r>
+      <w:proofErr w:type="spellStart"/>
+      <w:r>
         <w:rPr>
           <w:i/>
           <w:iCs/>
           <w:color w:val="4472C4" w:themeColor="accent1"/>
         </w:rPr>
-      </w:pPr>
+        <w:t>model.predict</w:t>
+      </w:r>
+      <w:proofErr w:type="spellEnd"/>
       <w:r>
         <w:rPr>
           <w:i/>
           <w:iCs/>
           <w:color w:val="4472C4" w:themeColor="accent1"/>
         </w:rPr>
-        <w:t xml:space="preserve"># The one you picked from the ROC analysis </w:t>
-      </w:r>
-    </w:p>
-    <w:p>
-      <w:pPr>
+        <w:t>(</w:t>
+      </w:r>
+      <w:proofErr w:type="spellStart"/>
+      <w:r>
         <w:rPr>
           <w:i/>
           <w:iCs/>
           <w:color w:val="4472C4" w:themeColor="accent1"/>
         </w:rPr>
-      </w:pPr>
+        <w:t>x_test</w:t>
+      </w:r>
+      <w:proofErr w:type="spellEnd"/>
       <w:r>
         <w:rPr>
           <w:i/>
           <w:iCs/>
           <w:color w:val="4472C4" w:themeColor="accent1"/>
         </w:rPr>
-        <w:t>y_probs = model.predict_proba(x_test)[:, 1] y_pred_custom = (y_probs &gt;= custom_threshold).astype(int)</w:t>
+        <w:t xml:space="preserve">) </w:t>
+      </w:r>
+    </w:p>
+    <w:p>
+      <w:pPr>
+        <w:rPr>
+          <w:i/>
+          <w:iCs/>
+          <w:color w:val="4472C4" w:themeColor="accent1"/>
+        </w:rPr>
+      </w:pPr>
+      <w:r>
+        <w:rPr>
+          <w:i/>
+          <w:iCs/>
+          <w:color w:val="4472C4" w:themeColor="accent1"/>
+        </w:rPr>
+        <w:t xml:space="preserve"># Use your custom threshold: </w:t>
+      </w:r>
+      <w:proofErr w:type="spellStart"/>
+      <w:r>
+        <w:rPr>
+          <w:i/>
+          <w:iCs/>
+          <w:color w:val="4472C4" w:themeColor="accent1"/>
+        </w:rPr>
+        <w:t>custom_threshold</w:t>
+      </w:r>
+      <w:proofErr w:type="spellEnd"/>
+      <w:r>
+        <w:rPr>
+          <w:i/>
+          <w:iCs/>
+          <w:color w:val="4472C4" w:themeColor="accent1"/>
+        </w:rPr>
+        <w:t xml:space="preserve"> = 0.35 </w:t>
+      </w:r>
+    </w:p>
+    <w:p>
+      <w:pPr>
+        <w:rPr>
+          <w:i/>
+          <w:iCs/>
+          <w:color w:val="4472C4" w:themeColor="accent1"/>
+        </w:rPr>
+      </w:pPr>
+      <w:r>
+        <w:rPr>
+          <w:i/>
+          <w:iCs/>
+          <w:color w:val="4472C4" w:themeColor="accent1"/>
+        </w:rPr>
+        <w:t xml:space="preserve"># The one you picked from the ROC analysis </w:t>
+      </w:r>
+    </w:p>
+    <w:p>
+      <w:pPr>
+        <w:rPr>
+          <w:i/>
+          <w:iCs/>
+          <w:color w:val="4472C4" w:themeColor="accent1"/>
+        </w:rPr>
+      </w:pPr>
+      <w:proofErr w:type="spellStart"/>
+      <w:r>
+        <w:rPr>
+          <w:i/>
+          <w:iCs/>
+          <w:color w:val="4472C4" w:themeColor="accent1"/>
+        </w:rPr>
+        <w:t>y_probs</w:t>
+      </w:r>
+      <w:proofErr w:type="spellEnd"/>
+      <w:r>
+        <w:rPr>
+          <w:i/>
+          <w:iCs/>
+          <w:color w:val="4472C4" w:themeColor="accent1"/>
+        </w:rPr>
+        <w:t xml:space="preserve"> = </w:t>
+      </w:r>
+      <w:proofErr w:type="spellStart"/>
+      <w:r>
+        <w:rPr>
+          <w:i/>
+          <w:iCs/>
+          <w:color w:val="4472C4" w:themeColor="accent1"/>
+        </w:rPr>
+        <w:t>model.predict_proba</w:t>
+      </w:r>
+      <w:proofErr w:type="spellEnd"/>
+      <w:r>
+        <w:rPr>
+          <w:i/>
+          <w:iCs/>
+          <w:color w:val="4472C4" w:themeColor="accent1"/>
+        </w:rPr>
+        <w:t>(</w:t>
+      </w:r>
+      <w:proofErr w:type="spellStart"/>
+      <w:r>
+        <w:rPr>
+          <w:i/>
+          <w:iCs/>
+          <w:color w:val="4472C4" w:themeColor="accent1"/>
+        </w:rPr>
+        <w:t>x_test</w:t>
+      </w:r>
+      <w:proofErr w:type="spellEnd"/>
+      <w:r>
+        <w:rPr>
+          <w:i/>
+          <w:iCs/>
+          <w:color w:val="4472C4" w:themeColor="accent1"/>
+        </w:rPr>
+        <w:t xml:space="preserve">)[:, 1] </w:t>
+      </w:r>
+      <w:proofErr w:type="spellStart"/>
+      <w:r>
+        <w:rPr>
+          <w:i/>
+          <w:iCs/>
+          <w:color w:val="4472C4" w:themeColor="accent1"/>
+        </w:rPr>
+        <w:t>y_pred_custom</w:t>
+      </w:r>
+      <w:proofErr w:type="spellEnd"/>
+      <w:r>
+        <w:rPr>
+          <w:i/>
+          <w:iCs/>
+          <w:color w:val="4472C4" w:themeColor="accent1"/>
+        </w:rPr>
+        <w:t xml:space="preserve"> = (</w:t>
+      </w:r>
+      <w:proofErr w:type="spellStart"/>
+      <w:r>
+        <w:rPr>
+          <w:i/>
+          <w:iCs/>
+          <w:color w:val="4472C4" w:themeColor="accent1"/>
+        </w:rPr>
+        <w:t>y_probs</w:t>
+      </w:r>
+      <w:proofErr w:type="spellEnd"/>
+      <w:r>
+        <w:rPr>
+          <w:i/>
+          <w:iCs/>
+          <w:color w:val="4472C4" w:themeColor="accent1"/>
+        </w:rPr>
+        <w:t xml:space="preserve"> &gt;= </w:t>
+      </w:r>
+      <w:proofErr w:type="spellStart"/>
+      <w:r>
+        <w:rPr>
+          <w:i/>
+          <w:iCs/>
+          <w:color w:val="4472C4" w:themeColor="accent1"/>
+        </w:rPr>
+        <w:t>custom_threshold</w:t>
+      </w:r>
+      <w:proofErr w:type="spellEnd"/>
+      <w:r>
+        <w:rPr>
+          <w:i/>
+          <w:iCs/>
+          <w:color w:val="4472C4" w:themeColor="accent1"/>
+        </w:rPr>
+        <w:t>).</w:t>
+      </w:r>
+      <w:proofErr w:type="spellStart"/>
+      <w:r>
+        <w:rPr>
+          <w:i/>
+          <w:iCs/>
+          <w:color w:val="4472C4" w:themeColor="accent1"/>
+        </w:rPr>
+        <w:t>astype</w:t>
+      </w:r>
+      <w:proofErr w:type="spellEnd"/>
+      <w:r>
+        <w:rPr>
+          <w:i/>
+          <w:iCs/>
+          <w:color w:val="4472C4" w:themeColor="accent1"/>
+        </w:rPr>
+        <w:t>(int)</w:t>
       </w:r>
     </w:p>
     <w:p/>
@@ -6258,7 +6921,15 @@
     </w:p>
     <w:p>
       <w:r>
-        <w:t>While k models are indeed created during the process, the goal of K-Fold Cross-Validation (CV) is to evaluate the performance of your modeling approach, not to produce the final set of coefficients.</w:t>
+        <w:t xml:space="preserve">While k models are indeed created during the process, the goal of K-Fold Cross-Validation (CV) is to evaluate the performance of your </w:t>
+      </w:r>
+      <w:proofErr w:type="spellStart"/>
+      <w:r>
+        <w:t>modeling</w:t>
+      </w:r>
+      <w:proofErr w:type="spellEnd"/>
+      <w:r>
+        <w:t xml:space="preserve"> approach, not to produce the final set of coefficients.</w:t>
       </w:r>
     </w:p>
     <w:p>
@@ -6343,7 +7014,7 @@
                     <pic:cNvPicPr/>
                   </pic:nvPicPr>
                   <pic:blipFill>
-                    <a:blip r:embed="rId35"/>
+                    <a:blip r:embed="rId39"/>
                     <a:stretch>
                       <a:fillRect/>
                     </a:stretch>
@@ -6421,7 +7092,15 @@
         </w:numPr>
       </w:pPr>
       <w:r>
-        <w:t>Sequentially extract random data point using trainsize argument from 10% to 100%</w:t>
+        <w:t xml:space="preserve">Sequentially extract random data point using </w:t>
+      </w:r>
+      <w:proofErr w:type="spellStart"/>
+      <w:r>
+        <w:t>trainsize</w:t>
+      </w:r>
+      <w:proofErr w:type="spellEnd"/>
+      <w:r>
+        <w:t xml:space="preserve"> argument from 10% to 100%</w:t>
       </w:r>
     </w:p>
     <w:p>
@@ -6475,7 +7154,7 @@
                     </pic:cNvPicPr>
                   </pic:nvPicPr>
                   <pic:blipFill>
-                    <a:blip r:embed="rId36">
+                    <a:blip r:embed="rId40">
                       <a:extLst>
                         <a:ext uri="{28A0092B-C50C-407E-A947-70E740481C1C}">
                           <a14:useLocalDpi xmlns:a14="http://schemas.microsoft.com/office/drawing/2010/main" val="0"/>
@@ -6528,7 +7207,15 @@
     </w:p>
     <w:p>
       <w:r>
-        <w:t xml:space="preserve">During a GridSearchCV, the system doesn't just look at a single TPR/FPR point. </w:t>
+        <w:t xml:space="preserve">During a </w:t>
+      </w:r>
+      <w:proofErr w:type="spellStart"/>
+      <w:r>
+        <w:t>GridSearchCV</w:t>
+      </w:r>
+      <w:proofErr w:type="spellEnd"/>
+      <w:r>
+        <w:t xml:space="preserve">, the system doesn't just look at a single TPR/FPR point. </w:t>
       </w:r>
     </w:p>
     <w:p>
@@ -6579,13 +7266,26 @@
       <w:r>
         <w:t xml:space="preserve"> </w:t>
       </w:r>
-      <w:r>
-        <w:t>best_estimator_.</w:t>
-      </w:r>
-    </w:p>
-    <w:p>
-      <w:r>
-        <w:t>The process of calculating AUC for every cross validatations is done for all the different parameters to find the one with the best fit</w:t>
+      <w:proofErr w:type="spellStart"/>
+      <w:r>
+        <w:t>best_estimator</w:t>
+      </w:r>
+      <w:proofErr w:type="spellEnd"/>
+      <w:r>
+        <w:t>_.</w:t>
+      </w:r>
+    </w:p>
+    <w:p>
+      <w:r>
+        <w:t xml:space="preserve">The process of calculating AUC for every cross </w:t>
+      </w:r>
+      <w:proofErr w:type="spellStart"/>
+      <w:r>
+        <w:t>validatations</w:t>
+      </w:r>
+      <w:proofErr w:type="spellEnd"/>
+      <w:r>
+        <w:t xml:space="preserve"> is done for all the different parameters to find the one with the best fit</w:t>
       </w:r>
     </w:p>
     <w:p/>
@@ -7446,7 +8146,15 @@
     </w:p>
     <w:p>
       <w:r>
-        <w:t>For both blue and green label, we would determine the GINI coefficient. The gini coefficient for Blu label is calculated as G = 1 – P1^2 – P2^2. Here P1 and P2 shows the purity of Blue for respective classes</w:t>
+        <w:t xml:space="preserve">For both blue and green label, we would determine the GINI coefficient. The </w:t>
+      </w:r>
+      <w:proofErr w:type="spellStart"/>
+      <w:r>
+        <w:t>gini</w:t>
+      </w:r>
+      <w:proofErr w:type="spellEnd"/>
+      <w:r>
+        <w:t xml:space="preserve"> coefficient for Blu label is calculated as G = 1 – P1^2 – P2^2. Here P1 and P2 shows the purity of Blue for respective classes</w:t>
       </w:r>
     </w:p>
     <w:tbl>
@@ -8305,7 +9013,15 @@
         <w:t>Easier to understand and versatile</w:t>
       </w:r>
       <w:r>
-        <w:t xml:space="preserve">, can capture non linear relationships, and can handle outliers  </w:t>
+        <w:t xml:space="preserve">, can capture </w:t>
+      </w:r>
+      <w:proofErr w:type="spellStart"/>
+      <w:r>
+        <w:t>non linear</w:t>
+      </w:r>
+      <w:proofErr w:type="spellEnd"/>
+      <w:r>
+        <w:t xml:space="preserve"> relationships, and can handle outliers  </w:t>
       </w:r>
     </w:p>
     <w:p>
@@ -8326,7 +9042,23 @@
           <w:b/>
           <w:bCs/>
         </w:rPr>
-        <w:t>How to Hypertune decision trees</w:t>
+        <w:t xml:space="preserve">How to </w:t>
+      </w:r>
+      <w:proofErr w:type="spellStart"/>
+      <w:r>
+        <w:rPr>
+          <w:b/>
+          <w:bCs/>
+        </w:rPr>
+        <w:t>Hypertune</w:t>
+      </w:r>
+      <w:proofErr w:type="spellEnd"/>
+      <w:r>
+        <w:rPr>
+          <w:b/>
+          <w:bCs/>
+        </w:rPr>
+        <w:t xml:space="preserve"> decision trees</w:t>
       </w:r>
       <w:r>
         <w:t xml:space="preserve"> –</w:t>
@@ -8425,9 +9157,11 @@
       <w:r>
         <w:t>(</w:t>
       </w:r>
+      <w:proofErr w:type="spellStart"/>
       <w:r>
         <w:t>i</w:t>
       </w:r>
+      <w:proofErr w:type="spellEnd"/>
       <w:r>
         <w:t xml:space="preserve">) * </w:t>
       </w:r>
@@ -8437,9 +9171,11 @@
       <w:r>
         <w:t>(</w:t>
       </w:r>
+      <w:proofErr w:type="spellStart"/>
       <w:r>
         <w:t>i</w:t>
       </w:r>
+      <w:proofErr w:type="spellEnd"/>
       <w:r>
         <w:t>)</w:t>
       </w:r>
@@ -8521,7 +9257,15 @@
         </w:numPr>
       </w:pPr>
       <w:r>
-        <w:t>Gini Impurity (for classification): Measures the probability of incorrectly classifying a randomly chosen element in the dataset if it were randomly labeled according to the distribution of labels in the subset. A Gini impurity of 0 means a perfectly pure node (all samples belong to the same class).</w:t>
+        <w:t xml:space="preserve">Gini Impurity (for classification): Measures the probability of incorrectly classifying a randomly chosen element in the dataset if it were randomly </w:t>
+      </w:r>
+      <w:proofErr w:type="spellStart"/>
+      <w:r>
+        <w:t>labeled</w:t>
+      </w:r>
+      <w:proofErr w:type="spellEnd"/>
+      <w:r>
+        <w:t xml:space="preserve"> according to the distribution of labels in the subset. A Gini impurity of 0 means a perfectly pure node (all samples belong to the same class).</w:t>
       </w:r>
     </w:p>
     <w:p>
@@ -8604,7 +9348,7 @@
       <w:r>
         <w:t xml:space="preserve">URL - </w:t>
       </w:r>
-      <w:hyperlink r:id="rId37" w:history="1">
+      <w:hyperlink r:id="rId41" w:history="1">
         <w:r>
           <w:rPr>
             <w:rStyle w:val="Hyperlink"/>
@@ -8834,7 +9578,15 @@
     <w:p>
       <w:r>
         <w:tab/>
-        <w:t>W(i) = W(i-1) if there was correct classification, W(i-1) * alpha if there was incorrect classification</w:t>
+        <w:t>W(</w:t>
+      </w:r>
+      <w:proofErr w:type="spellStart"/>
+      <w:r>
+        <w:t>i</w:t>
+      </w:r>
+      <w:proofErr w:type="spellEnd"/>
+      <w:r>
+        <w:t>) = W(i-1) if there was correct classification, W(i-1) * alpha if there was incorrect classification</w:t>
       </w:r>
     </w:p>
     <w:p>
@@ -8844,7 +9596,15 @@
     </w:p>
     <w:p>
       <w:r>
-        <w:t xml:space="preserve">Hyper tuning parameters in Adaboost: </w:t>
+        <w:t xml:space="preserve">Hyper tuning parameters in </w:t>
+      </w:r>
+      <w:proofErr w:type="spellStart"/>
+      <w:r>
+        <w:t>Adaboost</w:t>
+      </w:r>
+      <w:proofErr w:type="spellEnd"/>
+      <w:r>
+        <w:t xml:space="preserve">: </w:t>
       </w:r>
     </w:p>
     <w:p>
@@ -8885,10 +9645,12 @@
           <w:numId w:val="15"/>
         </w:numPr>
       </w:pPr>
+      <w:proofErr w:type="spellStart"/>
       <w:r>
         <w:lastRenderedPageBreak/>
         <w:t>base_estimator</w:t>
       </w:r>
+      <w:proofErr w:type="spellEnd"/>
       <w:r>
         <w:t>: You can also use logistics regression in addition to decision trees</w:t>
       </w:r>
@@ -8902,15 +9664,28 @@
         </w:numPr>
       </w:pPr>
       <w:r>
-        <w:t>base_estimator__max_depth</w:t>
-      </w:r>
+        <w:t>base_estimator__</w:t>
+      </w:r>
+      <w:proofErr w:type="spellStart"/>
+      <w:r>
+        <w:t>max_depth</w:t>
+      </w:r>
+      <w:proofErr w:type="spellEnd"/>
       <w:r>
         <w:t>: The depth of each decision tree. The default is 1</w:t>
       </w:r>
     </w:p>
     <w:p>
       <w:r>
-        <w:t>Benefits of Adaboost:</w:t>
+        <w:t xml:space="preserve">Benefits of </w:t>
+      </w:r>
+      <w:proofErr w:type="spellStart"/>
+      <w:r>
+        <w:t>Adaboost</w:t>
+      </w:r>
+      <w:proofErr w:type="spellEnd"/>
+      <w:r>
+        <w:t>:</w:t>
       </w:r>
     </w:p>
     <w:p>
@@ -8939,7 +9714,15 @@
     </w:p>
     <w:p>
       <w:r>
-        <w:t>Issues with Adaboost:</w:t>
+        <w:t xml:space="preserve">Issues with </w:t>
+      </w:r>
+      <w:proofErr w:type="spellStart"/>
+      <w:r>
+        <w:t>Adaboost</w:t>
+      </w:r>
+      <w:proofErr w:type="spellEnd"/>
+      <w:r>
+        <w:t>:</w:t>
       </w:r>
     </w:p>
     <w:p>
@@ -8957,7 +9740,15 @@
     <w:p/>
     <w:p>
       <w:r>
-        <w:t xml:space="preserve">XG boost is a multi class classifier and uses SoftMax function to calculate N different classification scores. </w:t>
+        <w:t xml:space="preserve">XG boost is a </w:t>
+      </w:r>
+      <w:proofErr w:type="spellStart"/>
+      <w:r>
+        <w:t>multi class</w:t>
+      </w:r>
+      <w:proofErr w:type="spellEnd"/>
+      <w:r>
+        <w:t xml:space="preserve"> classifier and uses SoftMax function to calculate N different classification scores. </w:t>
       </w:r>
     </w:p>
     <w:p/>
@@ -9004,7 +9795,15 @@
     </w:p>
     <w:p>
       <w:r>
-        <w:t xml:space="preserve">The labda is penalty term and if it is higher, we would need to reduce square of coefficients which would result in decrease of sensitivity. This would be result in low bias and thus reduce variance error due to overfit. </w:t>
+        <w:t xml:space="preserve">The </w:t>
+      </w:r>
+      <w:proofErr w:type="spellStart"/>
+      <w:r>
+        <w:t>labda</w:t>
+      </w:r>
+      <w:proofErr w:type="spellEnd"/>
+      <w:r>
+        <w:t xml:space="preserve"> is penalty term and if it is higher, we would need to reduce square of coefficients which would result in decrease of sensitivity. This would be result in low bias and thus reduce variance error due to overfit. </w:t>
       </w:r>
     </w:p>
     <w:p>
@@ -9152,7 +9951,7 @@
       <w:r>
         <w:t xml:space="preserve">Resources - </w:t>
       </w:r>
-      <w:hyperlink r:id="rId38" w:history="1">
+      <w:hyperlink r:id="rId42" w:history="1">
         <w:r>
           <w:rPr>
             <w:rStyle w:val="Hyperlink"/>
@@ -9178,12 +9977,36 @@
     </w:p>
     <w:p>
       <w:r>
-        <w:t xml:space="preserve">from sklearn.decomposition import PCA </w:t>
-      </w:r>
-    </w:p>
-    <w:p>
-      <w:r>
-        <w:t xml:space="preserve">from sklearn.preprocessing import StandardScaler </w:t>
+        <w:t xml:space="preserve">from </w:t>
+      </w:r>
+      <w:proofErr w:type="spellStart"/>
+      <w:r>
+        <w:t>sklearn.decomposition</w:t>
+      </w:r>
+      <w:proofErr w:type="spellEnd"/>
+      <w:r>
+        <w:t xml:space="preserve"> import PCA </w:t>
+      </w:r>
+    </w:p>
+    <w:p>
+      <w:r>
+        <w:t xml:space="preserve">from </w:t>
+      </w:r>
+      <w:proofErr w:type="spellStart"/>
+      <w:r>
+        <w:t>sklearn.preprocessing</w:t>
+      </w:r>
+      <w:proofErr w:type="spellEnd"/>
+      <w:r>
+        <w:t xml:space="preserve"> import </w:t>
+      </w:r>
+      <w:proofErr w:type="spellStart"/>
+      <w:r>
+        <w:t>StandardScaler</w:t>
+      </w:r>
+      <w:proofErr w:type="spellEnd"/>
+      <w:r>
+        <w:t xml:space="preserve"> </w:t>
       </w:r>
     </w:p>
     <w:p>
@@ -9201,12 +10024,33 @@
     </w:p>
     <w:p>
       <w:r>
-        <w:t xml:space="preserve">scaler = StandardScaler () </w:t>
-      </w:r>
-    </w:p>
-    <w:p>
-      <w:r>
-        <w:t xml:space="preserve">scaled_data = scaler.fit_transform(data) </w:t>
+        <w:t xml:space="preserve">scaler = </w:t>
+      </w:r>
+      <w:proofErr w:type="spellStart"/>
+      <w:r>
+        <w:t>StandardScaler</w:t>
+      </w:r>
+      <w:proofErr w:type="spellEnd"/>
+      <w:r>
+        <w:t xml:space="preserve"> () </w:t>
+      </w:r>
+    </w:p>
+    <w:p>
+      <w:proofErr w:type="spellStart"/>
+      <w:r>
+        <w:t>scaled_data</w:t>
+      </w:r>
+      <w:proofErr w:type="spellEnd"/>
+      <w:r>
+        <w:t xml:space="preserve"> = </w:t>
+      </w:r>
+      <w:proofErr w:type="spellStart"/>
+      <w:r>
+        <w:t>scaler.fit_transform</w:t>
+      </w:r>
+      <w:proofErr w:type="spellEnd"/>
+      <w:r>
+        <w:t xml:space="preserve">(data) </w:t>
       </w:r>
     </w:p>
     <w:p>
@@ -9227,8 +10071,21 @@
         </w:rPr>
         <w:t xml:space="preserve">   </w:t>
       </w:r>
-      <w:r>
-        <w:t xml:space="preserve">pca = PCA(n_components=2) </w:t>
+      <w:proofErr w:type="spellStart"/>
+      <w:r>
+        <w:t>pca</w:t>
+      </w:r>
+      <w:proofErr w:type="spellEnd"/>
+      <w:r>
+        <w:t xml:space="preserve"> = PCA(</w:t>
+      </w:r>
+      <w:proofErr w:type="spellStart"/>
+      <w:r>
+        <w:t>n_components</w:t>
+      </w:r>
+      <w:proofErr w:type="spellEnd"/>
+      <w:r>
+        <w:t xml:space="preserve">=2) </w:t>
       </w:r>
       <w:r>
         <w:t xml:space="preserve"> </w:t>
@@ -9272,8 +10129,29 @@
           <w:color w:val="4472C4" w:themeColor="accent1"/>
         </w:rPr>
       </w:pPr>
-      <w:r>
-        <w:t xml:space="preserve">transformed_data = pca.fit_transform(scaled_data) </w:t>
+      <w:proofErr w:type="spellStart"/>
+      <w:r>
+        <w:t>transformed_data</w:t>
+      </w:r>
+      <w:proofErr w:type="spellEnd"/>
+      <w:r>
+        <w:t xml:space="preserve"> = </w:t>
+      </w:r>
+      <w:proofErr w:type="spellStart"/>
+      <w:r>
+        <w:t>pca.fit_transform</w:t>
+      </w:r>
+      <w:proofErr w:type="spellEnd"/>
+      <w:r>
+        <w:t>(</w:t>
+      </w:r>
+      <w:proofErr w:type="spellStart"/>
+      <w:r>
+        <w:t>scaled_data</w:t>
+      </w:r>
+      <w:proofErr w:type="spellEnd"/>
+      <w:r>
+        <w:t xml:space="preserve">) </w:t>
       </w:r>
     </w:p>
     <w:p>
@@ -9283,8 +10161,21 @@
         </w:rPr>
         <w:t xml:space="preserve"># Access the principal components </w:t>
       </w:r>
-      <w:r>
-        <w:t xml:space="preserve">principal_components = pca.components_ </w:t>
+      <w:proofErr w:type="spellStart"/>
+      <w:r>
+        <w:t>principal_components</w:t>
+      </w:r>
+      <w:proofErr w:type="spellEnd"/>
+      <w:r>
+        <w:t xml:space="preserve"> = </w:t>
+      </w:r>
+      <w:proofErr w:type="spellStart"/>
+      <w:r>
+        <w:t>pca.components</w:t>
+      </w:r>
+      <w:proofErr w:type="spellEnd"/>
+      <w:r>
+        <w:t xml:space="preserve">_ </w:t>
       </w:r>
     </w:p>
     <w:p>
@@ -9294,8 +10185,21 @@
         </w:rPr>
         <w:t xml:space="preserve"># Access the explained variance ratio </w:t>
       </w:r>
-      <w:r>
-        <w:t>explained_variance_ratio = pca.explained_variance_ratio_</w:t>
+      <w:proofErr w:type="spellStart"/>
+      <w:r>
+        <w:t>explained_variance_ratio</w:t>
+      </w:r>
+      <w:proofErr w:type="spellEnd"/>
+      <w:r>
+        <w:t xml:space="preserve"> = </w:t>
+      </w:r>
+      <w:proofErr w:type="spellStart"/>
+      <w:r>
+        <w:t>pca.explained_variance_ratio</w:t>
+      </w:r>
+      <w:proofErr w:type="spellEnd"/>
+      <w:r>
+        <w:t>_</w:t>
       </w:r>
     </w:p>
     <w:p>
@@ -9554,8 +10458,13 @@
           <w:numId w:val="22"/>
         </w:numPr>
       </w:pPr>
-      <w:r>
-        <w:t>Liblinear – Normal gradient descent</w:t>
+      <w:proofErr w:type="spellStart"/>
+      <w:r>
+        <w:t>Liblinear</w:t>
+      </w:r>
+      <w:proofErr w:type="spellEnd"/>
+      <w:r>
+        <w:t xml:space="preserve"> – Normal gradient descent</w:t>
       </w:r>
     </w:p>
     <w:p>
@@ -9566,9 +10475,11 @@
           <w:numId w:val="22"/>
         </w:numPr>
       </w:pPr>
+      <w:proofErr w:type="spellStart"/>
       <w:r>
         <w:t>Lbfgs</w:t>
       </w:r>
+      <w:proofErr w:type="spellEnd"/>
       <w:r>
         <w:t xml:space="preserve"> – A newton-based method used as default for the regressions</w:t>
       </w:r>
@@ -9613,8 +10524,21 @@
       <w:r>
         <w:t xml:space="preserve">Which one to use - </w:t>
       </w:r>
-      <w:r>
-        <w:t>liblinear is best for smaller datasets, while lbfgs, sag, saga, and newton-cg are better for larger ones.</w:t>
+      <w:proofErr w:type="spellStart"/>
+      <w:r>
+        <w:t>liblinear</w:t>
+      </w:r>
+      <w:proofErr w:type="spellEnd"/>
+      <w:r>
+        <w:t xml:space="preserve"> is best for smaller datasets, while </w:t>
+      </w:r>
+      <w:proofErr w:type="spellStart"/>
+      <w:r>
+        <w:t>lbfgs</w:t>
+      </w:r>
+      <w:proofErr w:type="spellEnd"/>
+      <w:r>
+        <w:t>, sag, saga, and newton-cg are better for larger ones.</w:t>
       </w:r>
     </w:p>
     <w:p>
@@ -9845,7 +10769,7 @@
                     </pic:cNvPicPr>
                   </pic:nvPicPr>
                   <pic:blipFill>
-                    <a:blip r:embed="rId39">
+                    <a:blip r:embed="rId43">
                       <a:extLst>
                         <a:ext uri="{28A0092B-C50C-407E-A947-70E740481C1C}">
                           <a14:useLocalDpi xmlns:a14="http://schemas.microsoft.com/office/drawing/2010/main" val="0"/>
@@ -9926,17 +10850,59 @@
     </w:p>
     <w:p>
       <w:r>
-        <w:t>from statsmodels.tsa.stattools import adfuller</w:t>
-      </w:r>
-    </w:p>
-    <w:p>
-      <w:r>
-        <w:t>from statsmodels.graphics.tsaplots import plot_acf, plot_pacf</w:t>
-      </w:r>
-    </w:p>
-    <w:p>
-      <w:r>
-        <w:t>from statsmodels.tsa.arima.model import ARIMA</w:t>
+        <w:t xml:space="preserve">from </w:t>
+      </w:r>
+      <w:proofErr w:type="spellStart"/>
+      <w:r>
+        <w:t>statsmodels.tsa.stattools</w:t>
+      </w:r>
+      <w:proofErr w:type="spellEnd"/>
+      <w:r>
+        <w:t xml:space="preserve"> import </w:t>
+      </w:r>
+      <w:proofErr w:type="spellStart"/>
+      <w:r>
+        <w:t>adfuller</w:t>
+      </w:r>
+      <w:proofErr w:type="spellEnd"/>
+    </w:p>
+    <w:p>
+      <w:r>
+        <w:t xml:space="preserve">from </w:t>
+      </w:r>
+      <w:proofErr w:type="spellStart"/>
+      <w:r>
+        <w:t>statsmodels.graphics.tsaplots</w:t>
+      </w:r>
+      <w:proofErr w:type="spellEnd"/>
+      <w:r>
+        <w:t xml:space="preserve"> import </w:t>
+      </w:r>
+      <w:proofErr w:type="spellStart"/>
+      <w:r>
+        <w:t>plot_acf</w:t>
+      </w:r>
+      <w:proofErr w:type="spellEnd"/>
+      <w:r>
+        <w:t xml:space="preserve">, </w:t>
+      </w:r>
+      <w:proofErr w:type="spellStart"/>
+      <w:r>
+        <w:t>plot_pacf</w:t>
+      </w:r>
+      <w:proofErr w:type="spellEnd"/>
+    </w:p>
+    <w:p>
+      <w:r>
+        <w:t xml:space="preserve">from </w:t>
+      </w:r>
+      <w:proofErr w:type="spellStart"/>
+      <w:r>
+        <w:t>statsmodels.tsa.arima.model</w:t>
+      </w:r>
+      <w:proofErr w:type="spellEnd"/>
+      <w:r>
+        <w:t xml:space="preserve"> import ARIMA</w:t>
       </w:r>
     </w:p>
     <w:p/>
@@ -10156,8 +11122,21 @@
           <w:numId w:val="40"/>
         </w:numPr>
       </w:pPr>
-      <w:r>
-        <w:t>f the trend component is too flexible, it might overfit to noise. Tuning changepoint_prior_scale helps mitigate this.</w:t>
+      <w:proofErr w:type="spellStart"/>
+      <w:r>
+        <w:t>f</w:t>
+      </w:r>
+      <w:proofErr w:type="spellEnd"/>
+      <w:r>
+        <w:t xml:space="preserve"> the trend component is too flexible, it might overfit to noise. Tuning </w:t>
+      </w:r>
+      <w:proofErr w:type="spellStart"/>
+      <w:r>
+        <w:t>changepoint_prior_scale</w:t>
+      </w:r>
+      <w:proofErr w:type="spellEnd"/>
+      <w:r>
+        <w:t xml:space="preserve"> helps mitigate this.</w:t>
       </w:r>
     </w:p>
     <w:p/>
@@ -10258,7 +11237,15 @@
     </w:p>
     <w:p>
       <w:r>
-        <w:t>Aggregate functions (sum, count, max, avg, min)</w:t>
+        <w:t xml:space="preserve">Aggregate functions (sum, count, max, </w:t>
+      </w:r>
+      <w:proofErr w:type="spellStart"/>
+      <w:r>
+        <w:t>avg</w:t>
+      </w:r>
+      <w:proofErr w:type="spellEnd"/>
+      <w:r>
+        <w:t>, min)</w:t>
       </w:r>
     </w:p>
     <w:p>
@@ -10330,7 +11317,15 @@
         </w:numPr>
       </w:pPr>
       <w:r>
-        <w:t>From first row to current row – sum (&lt;&lt;column name&gt;&gt;) over (partition by &lt;&lt;column name&gt;&gt; order by &lt;&lt;column name&gt;&gt; rows between unbounded proceding and current row)</w:t>
+        <w:t xml:space="preserve">From first row to current row – sum (&lt;&lt;column name&gt;&gt;) over (partition by &lt;&lt;column name&gt;&gt; order by &lt;&lt;column name&gt;&gt; rows between unbounded </w:t>
+      </w:r>
+      <w:proofErr w:type="spellStart"/>
+      <w:r>
+        <w:t>proceding</w:t>
+      </w:r>
+      <w:proofErr w:type="spellEnd"/>
+      <w:r>
+        <w:t xml:space="preserve"> and current row)</w:t>
       </w:r>
     </w:p>
     <w:p>
@@ -10396,7 +11391,15 @@
         </w:numPr>
       </w:pPr>
       <w:r>
-        <w:t>Summation functions such as sum, first, avg, last are rolling functions by default which gives you a summation of value from first row to current row. Thus you have to forcefully add in Rows between unbounded preceding and unbounded following if you want to take the rows</w:t>
+        <w:t xml:space="preserve">Summation functions such as sum, first, </w:t>
+      </w:r>
+      <w:proofErr w:type="spellStart"/>
+      <w:r>
+        <w:t>avg</w:t>
+      </w:r>
+      <w:proofErr w:type="spellEnd"/>
+      <w:r>
+        <w:t>, last are rolling functions by default which gives you a summation of value from first row to current row. Thus you have to forcefully add in Rows between unbounded preceding and unbounded following if you want to take the rows</w:t>
       </w:r>
     </w:p>
     <w:p>
@@ -10420,7 +11423,15 @@
         </w:numPr>
       </w:pPr>
       <w:r>
-        <w:t>Window function for percentile – Percent_rank()</w:t>
+        <w:t xml:space="preserve">Window function for percentile – </w:t>
+      </w:r>
+      <w:proofErr w:type="spellStart"/>
+      <w:r>
+        <w:t>Percent_rank</w:t>
+      </w:r>
+      <w:proofErr w:type="spellEnd"/>
+      <w:r>
+        <w:t>()</w:t>
       </w:r>
     </w:p>
     <w:p>
@@ -10432,7 +11443,15 @@
         </w:numPr>
       </w:pPr>
       <w:r>
-        <w:t>Syntax: Percent_rank() over (partition by &lt;&lt;&gt;&gt; order by &lt;&lt;&gt;&gt;)</w:t>
+        <w:t xml:space="preserve">Syntax: </w:t>
+      </w:r>
+      <w:proofErr w:type="spellStart"/>
+      <w:r>
+        <w:t>Percent_rank</w:t>
+      </w:r>
+      <w:proofErr w:type="spellEnd"/>
+      <w:r>
+        <w:t>() over (partition by &lt;&lt;&gt;&gt; order by &lt;&lt;&gt;&gt;)</w:t>
       </w:r>
     </w:p>
     <w:p/>
@@ -10675,7 +11694,15 @@
           </w:tcPr>
           <w:p>
             <w:r>
-              <w:t>Groups all records by CustomerID.</w:t>
+              <w:t xml:space="preserve">Groups all records by </w:t>
+            </w:r>
+            <w:proofErr w:type="spellStart"/>
+            <w:r>
+              <w:t>CustomerID</w:t>
+            </w:r>
+            <w:proofErr w:type="spellEnd"/>
+            <w:r>
+              <w:t>.</w:t>
             </w:r>
           </w:p>
         </w:tc>
@@ -10837,7 +11864,15 @@
           </w:tcPr>
           <w:p>
             <w:r>
-              <w:t>Specifies the final output columns: CustomerID and SUM(Amount).</w:t>
+              <w:t xml:space="preserve">Specifies the final output columns: </w:t>
+            </w:r>
+            <w:proofErr w:type="spellStart"/>
+            <w:r>
+              <w:t>CustomerID</w:t>
+            </w:r>
+            <w:proofErr w:type="spellEnd"/>
+            <w:r>
+              <w:t xml:space="preserve"> and SUM(Amount).</w:t>
             </w:r>
           </w:p>
         </w:tc>
@@ -10906,7 +11941,15 @@
         </w:numPr>
       </w:pPr>
       <w:r>
-        <w:t>Select instr(“hello hi”, “hi”)</w:t>
+        <w:t xml:space="preserve">Select </w:t>
+      </w:r>
+      <w:proofErr w:type="spellStart"/>
+      <w:r>
+        <w:t>instr</w:t>
+      </w:r>
+      <w:proofErr w:type="spellEnd"/>
+      <w:r>
+        <w:t>(“hello hi”, “hi”)</w:t>
       </w:r>
     </w:p>
     <w:p>
@@ -10917,9 +11960,19 @@
           <w:numId w:val="24"/>
         </w:numPr>
       </w:pPr>
-      <w:r>
-        <w:t>Substr – select substr</w:t>
-      </w:r>
+      <w:proofErr w:type="spellStart"/>
+      <w:r>
+        <w:t>Substr</w:t>
+      </w:r>
+      <w:proofErr w:type="spellEnd"/>
+      <w:r>
+        <w:t xml:space="preserve"> – select </w:t>
+      </w:r>
+      <w:proofErr w:type="spellStart"/>
+      <w:r>
+        <w:t>substr</w:t>
+      </w:r>
+      <w:proofErr w:type="spellEnd"/>
       <w:r>
         <w:t xml:space="preserve"> </w:t>
       </w:r>
@@ -10983,7 +12036,7 @@
       <w:r>
         <w:t xml:space="preserve">URL - </w:t>
       </w:r>
-      <w:hyperlink r:id="rId40" w:history="1">
+      <w:hyperlink r:id="rId44" w:history="1">
         <w:r>
           <w:rPr>
             <w:rStyle w:val="Hyperlink"/>
@@ -10996,7 +12049,7 @@
       <w:r>
         <w:t xml:space="preserve">Code - </w:t>
       </w:r>
-      <w:hyperlink r:id="rId41" w:history="1">
+      <w:hyperlink r:id="rId45" w:history="1">
         <w:r>
           <w:rPr>
             <w:rStyle w:val="Hyperlink"/>
@@ -11009,7 +12062,7 @@
       <w:r>
         <w:t xml:space="preserve">Code  - </w:t>
       </w:r>
-      <w:hyperlink r:id="rId42" w:history="1">
+      <w:hyperlink r:id="rId46" w:history="1">
         <w:r>
           <w:rPr>
             <w:rStyle w:val="Hyperlink"/>
@@ -11202,14 +12255,32 @@
       <w:r>
         <w:t xml:space="preserve">Code: </w:t>
       </w:r>
-      <w:r>
-        <w:t>bgf = BetaGeoFitter</w:t>
-      </w:r>
+      <w:proofErr w:type="spellStart"/>
+      <w:r>
+        <w:t>bgf</w:t>
+      </w:r>
+      <w:proofErr w:type="spellEnd"/>
+      <w:r>
+        <w:t xml:space="preserve"> = </w:t>
+      </w:r>
+      <w:proofErr w:type="spellStart"/>
+      <w:r>
+        <w:t>BetaGeoFitter</w:t>
+      </w:r>
+      <w:proofErr w:type="spellEnd"/>
       <w:r>
         <w:t xml:space="preserve"> </w:t>
       </w:r>
       <w:r>
-        <w:t>(penalizer_coef=0.0)</w:t>
+        <w:t>(</w:t>
+      </w:r>
+      <w:proofErr w:type="spellStart"/>
+      <w:r>
+        <w:t>penalizer_coef</w:t>
+      </w:r>
+      <w:proofErr w:type="spellEnd"/>
+      <w:r>
+        <w:t>=0.0)</w:t>
       </w:r>
     </w:p>
     <w:p>
@@ -11427,7 +12498,15 @@
         <w:t>Method:</w:t>
       </w:r>
       <w:r>
-        <w:t xml:space="preserve"> Group customers by their observed recency ($t_x$), which is the time of their last purchase.</w:t>
+        <w:t xml:space="preserve"> Group customers by their observed recency ($</w:t>
+      </w:r>
+      <w:proofErr w:type="spellStart"/>
+      <w:r>
+        <w:t>t_x</w:t>
+      </w:r>
+      <w:proofErr w:type="spellEnd"/>
+      <w:r>
+        <w:t>$), which is the time of their last purchase.</w:t>
       </w:r>
     </w:p>
     <w:p>
@@ -11815,7 +12894,15 @@
         <w:t>Method:</w:t>
       </w:r>
       <w:r>
-        <w:t xml:space="preserve"> If you used a full Bayesian method (like MCMC/PyMC) to estimate the posterior distribution of </w:t>
+        <w:t xml:space="preserve"> If you used a full Bayesian method (like MCMC/</w:t>
+      </w:r>
+      <w:proofErr w:type="spellStart"/>
+      <w:r>
+        <w:t>PyMC</w:t>
+      </w:r>
+      <w:proofErr w:type="spellEnd"/>
+      <w:r>
+        <w:t xml:space="preserve">) to estimate the posterior distribution of </w:t>
       </w:r>
       <w:r>
         <w:rPr>
@@ -11970,8 +13057,13 @@
           <w:numId w:val="31"/>
         </w:numPr>
       </w:pPr>
-      <w:r>
-        <w:t>Date_add(&lt;&lt;start date&gt;&gt;, interval &lt;&lt;number&gt;&gt; &lt;&lt;unit&gt;&gt;)</w:t>
+      <w:proofErr w:type="spellStart"/>
+      <w:r>
+        <w:t>Date_add</w:t>
+      </w:r>
+      <w:proofErr w:type="spellEnd"/>
+      <w:r>
+        <w:t>(&lt;&lt;start date&gt;&gt;, interval &lt;&lt;number&gt;&gt; &lt;&lt;unit&gt;&gt;)</w:t>
       </w:r>
     </w:p>
     <w:p>
@@ -12001,36 +13093,68 @@
           <w:i/>
           <w:iCs/>
         </w:rPr>
-        <w:t>select date_add(current_date(), interval 4 month)</w:t>
-      </w:r>
-    </w:p>
-    <w:p>
-      <w:pPr>
+        <w:t xml:space="preserve">select </w:t>
+      </w:r>
+      <w:proofErr w:type="spellStart"/>
+      <w:r>
         <w:rPr>
           <w:i/>
           <w:iCs/>
         </w:rPr>
-      </w:pPr>
+        <w:t>date_add</w:t>
+      </w:r>
+      <w:proofErr w:type="spellEnd"/>
       <w:r>
         <w:rPr>
           <w:i/>
           <w:iCs/>
         </w:rPr>
-        <w:t>the duration type could be day, month, quarter, hour, second etc</w:t>
-      </w:r>
-    </w:p>
-    <w:p>
-      <w:pPr>
+        <w:t>(</w:t>
+      </w:r>
+      <w:proofErr w:type="spellStart"/>
+      <w:r>
         <w:rPr>
           <w:i/>
           <w:iCs/>
         </w:rPr>
-      </w:pPr>
+        <w:t>current_date</w:t>
+      </w:r>
+      <w:proofErr w:type="spellEnd"/>
       <w:r>
         <w:rPr>
           <w:i/>
           <w:iCs/>
         </w:rPr>
+        <w:t>(), interval 4 month)</w:t>
+      </w:r>
+    </w:p>
+    <w:p>
+      <w:pPr>
+        <w:rPr>
+          <w:i/>
+          <w:iCs/>
+        </w:rPr>
+      </w:pPr>
+      <w:r>
+        <w:rPr>
+          <w:i/>
+          <w:iCs/>
+        </w:rPr>
+        <w:t>the duration type could be day, month, quarter, hour, second etc</w:t>
+      </w:r>
+    </w:p>
+    <w:p>
+      <w:pPr>
+        <w:rPr>
+          <w:i/>
+          <w:iCs/>
+        </w:rPr>
+      </w:pPr>
+      <w:r>
+        <w:rPr>
+          <w:i/>
+          <w:iCs/>
+        </w:rPr>
         <w:lastRenderedPageBreak/>
         <w:t>The number can be negative if you want an earlier number</w:t>
       </w:r>
@@ -12052,11 +13176,24 @@
         </w:numPr>
       </w:pPr>
       <w:r>
-        <w:t>Current Date – Current_Date()</w:t>
-      </w:r>
-      <w:r>
-        <w:t xml:space="preserve"> # only for mysql</w:t>
-      </w:r>
+        <w:t xml:space="preserve">Current Date – </w:t>
+      </w:r>
+      <w:proofErr w:type="spellStart"/>
+      <w:r>
+        <w:t>Current_Date</w:t>
+      </w:r>
+      <w:proofErr w:type="spellEnd"/>
+      <w:r>
+        <w:t>()</w:t>
+      </w:r>
+      <w:r>
+        <w:t xml:space="preserve"> # only for </w:t>
+      </w:r>
+      <w:proofErr w:type="spellStart"/>
+      <w:r>
+        <w:t>mysql</w:t>
+      </w:r>
+      <w:proofErr w:type="spellEnd"/>
     </w:p>
     <w:p>
       <w:pPr>
@@ -12067,7 +13204,15 @@
         </w:numPr>
       </w:pPr>
       <w:r>
-        <w:t>Current Time Stamp – Current_Timestamp()</w:t>
+        <w:t xml:space="preserve">Current Time Stamp – </w:t>
+      </w:r>
+      <w:proofErr w:type="spellStart"/>
+      <w:r>
+        <w:t>Current_Timestamp</w:t>
+      </w:r>
+      <w:proofErr w:type="spellEnd"/>
+      <w:r>
+        <w:t>()</w:t>
       </w:r>
     </w:p>
     <w:p>
@@ -12079,7 +13224,15 @@
         </w:numPr>
       </w:pPr>
       <w:r>
-        <w:t>Current Time – Current_time()</w:t>
+        <w:t xml:space="preserve">Current Time – </w:t>
+      </w:r>
+      <w:proofErr w:type="spellStart"/>
+      <w:r>
+        <w:t>Current_time</w:t>
+      </w:r>
+      <w:proofErr w:type="spellEnd"/>
+      <w:r>
+        <w:t>()</w:t>
       </w:r>
     </w:p>
     <w:p>
@@ -12103,7 +13256,15 @@
         </w:numPr>
       </w:pPr>
       <w:r>
-        <w:t>Date – Date(current_timestamp())</w:t>
+        <w:t>Date – Date(</w:t>
+      </w:r>
+      <w:proofErr w:type="spellStart"/>
+      <w:r>
+        <w:t>current_timestamp</w:t>
+      </w:r>
+      <w:proofErr w:type="spellEnd"/>
+      <w:r>
+        <w:t>())</w:t>
       </w:r>
     </w:p>
     <w:p>
@@ -12115,7 +13276,15 @@
         </w:numPr>
       </w:pPr>
       <w:r>
-        <w:t>Quarter – quarter(current_timestamp())</w:t>
+        <w:t>Quarter – quarter(</w:t>
+      </w:r>
+      <w:proofErr w:type="spellStart"/>
+      <w:r>
+        <w:t>current_timestamp</w:t>
+      </w:r>
+      <w:proofErr w:type="spellEnd"/>
+      <w:r>
+        <w:t>())</w:t>
       </w:r>
     </w:p>
     <w:p>
@@ -12127,7 +13296,15 @@
         </w:numPr>
       </w:pPr>
       <w:r>
-        <w:t>Second – second(current_timestamp())</w:t>
+        <w:t>Second – second(</w:t>
+      </w:r>
+      <w:proofErr w:type="spellStart"/>
+      <w:r>
+        <w:t>current_timestamp</w:t>
+      </w:r>
+      <w:proofErr w:type="spellEnd"/>
+      <w:r>
+        <w:t>())</w:t>
       </w:r>
     </w:p>
     <w:p>
@@ -12139,7 +13316,15 @@
         </w:numPr>
       </w:pPr>
       <w:r>
-        <w:t>Day – day(current_timestamp())</w:t>
+        <w:t>Day – day(</w:t>
+      </w:r>
+      <w:proofErr w:type="spellStart"/>
+      <w:r>
+        <w:t>current_timestamp</w:t>
+      </w:r>
+      <w:proofErr w:type="spellEnd"/>
+      <w:r>
+        <w:t>())</w:t>
       </w:r>
     </w:p>
     <w:p>
@@ -12151,7 +13336,15 @@
         </w:numPr>
       </w:pPr>
       <w:r>
-        <w:t>Hour – hour(current_timestamp()))</w:t>
+        <w:t>Hour – hour(</w:t>
+      </w:r>
+      <w:proofErr w:type="spellStart"/>
+      <w:r>
+        <w:t>current_timestamp</w:t>
+      </w:r>
+      <w:proofErr w:type="spellEnd"/>
+      <w:r>
+        <w:t>()))</w:t>
       </w:r>
     </w:p>
     <w:p>
@@ -12163,7 +13356,15 @@
         </w:numPr>
       </w:pPr>
       <w:r>
-        <w:t>Month – month(current_timestamp()))</w:t>
+        <w:t>Month – month(</w:t>
+      </w:r>
+      <w:proofErr w:type="spellStart"/>
+      <w:r>
+        <w:t>current_timestamp</w:t>
+      </w:r>
+      <w:proofErr w:type="spellEnd"/>
+      <w:r>
+        <w:t>()))</w:t>
       </w:r>
     </w:p>
     <w:p>
@@ -12175,7 +13376,15 @@
         </w:numPr>
       </w:pPr>
       <w:r>
-        <w:t>Year – year(current_timestamp()))</w:t>
+        <w:t>Year – year(</w:t>
+      </w:r>
+      <w:proofErr w:type="spellStart"/>
+      <w:r>
+        <w:t>current_timestamp</w:t>
+      </w:r>
+      <w:proofErr w:type="spellEnd"/>
+      <w:r>
+        <w:t>()))</w:t>
       </w:r>
     </w:p>
     <w:p>
@@ -12187,7 +13396,15 @@
         </w:numPr>
       </w:pPr>
       <w:r>
-        <w:t>Week – week(current_timestamp()))</w:t>
+        <w:t>Week – week(</w:t>
+      </w:r>
+      <w:proofErr w:type="spellStart"/>
+      <w:r>
+        <w:t>current_timestamp</w:t>
+      </w:r>
+      <w:proofErr w:type="spellEnd"/>
+      <w:r>
+        <w:t>()))</w:t>
       </w:r>
     </w:p>
     <w:p>
@@ -12199,7 +13416,23 @@
         </w:numPr>
       </w:pPr>
       <w:r>
-        <w:t>Day Name – dayname (current_timestamp())</w:t>
+        <w:t xml:space="preserve">Day Name – </w:t>
+      </w:r>
+      <w:proofErr w:type="spellStart"/>
+      <w:r>
+        <w:t>dayname</w:t>
+      </w:r>
+      <w:proofErr w:type="spellEnd"/>
+      <w:r>
+        <w:t xml:space="preserve"> (</w:t>
+      </w:r>
+      <w:proofErr w:type="spellStart"/>
+      <w:r>
+        <w:t>current_timestamp</w:t>
+      </w:r>
+      <w:proofErr w:type="spellEnd"/>
+      <w:r>
+        <w:t>())</w:t>
       </w:r>
     </w:p>
     <w:p>
@@ -12217,7 +13450,31 @@
         </w:numPr>
       </w:pPr>
       <w:r>
-        <w:t>Datediff – dateDiff(start_date, end_date)</w:t>
+        <w:t xml:space="preserve">Datediff – </w:t>
+      </w:r>
+      <w:proofErr w:type="spellStart"/>
+      <w:r>
+        <w:t>dateDiff</w:t>
+      </w:r>
+      <w:proofErr w:type="spellEnd"/>
+      <w:r>
+        <w:t>(</w:t>
+      </w:r>
+      <w:proofErr w:type="spellStart"/>
+      <w:r>
+        <w:t>start_date</w:t>
+      </w:r>
+      <w:proofErr w:type="spellEnd"/>
+      <w:r>
+        <w:t xml:space="preserve">, </w:t>
+      </w:r>
+      <w:proofErr w:type="spellStart"/>
+      <w:r>
+        <w:t>end_date</w:t>
+      </w:r>
+      <w:proofErr w:type="spellEnd"/>
+      <w:r>
+        <w:t>)</w:t>
       </w:r>
     </w:p>
     <w:p/>
@@ -12233,112 +13490,55 @@
           <w:i/>
           <w:iCs/>
         </w:rPr>
-        <w:t xml:space="preserve">select datediff(date_add(current_date(), interval 4 month), </w:t>
-      </w:r>
-    </w:p>
-    <w:p>
-      <w:pPr>
+        <w:t xml:space="preserve">select </w:t>
+      </w:r>
+      <w:proofErr w:type="spellStart"/>
+      <w:r>
         <w:rPr>
           <w:i/>
           <w:iCs/>
         </w:rPr>
-      </w:pPr>
+        <w:t>datediff</w:t>
+      </w:r>
+      <w:proofErr w:type="spellEnd"/>
       <w:r>
         <w:rPr>
           <w:i/>
           <w:iCs/>
         </w:rPr>
-        <w:t xml:space="preserve">                current_date()) --only returns the different in days</w:t>
-      </w:r>
-    </w:p>
-    <w:p/>
-    <w:p>
-      <w:pPr>
-        <w:pStyle w:val="ListParagraph"/>
-        <w:numPr>
-          <w:ilvl w:val="0"/>
-          <w:numId w:val="31"/>
-        </w:numPr>
-      </w:pPr>
-      <w:r>
-        <w:t>Timestampdiff</w:t>
-      </w:r>
-      <w:r>
-        <w:t xml:space="preserve"> – </w:t>
-      </w:r>
-      <w:r>
-        <w:t>timestampdiff</w:t>
-      </w:r>
-      <w:r>
-        <w:t>(unit, start_date, end_date)</w:t>
-      </w:r>
-    </w:p>
-    <w:p>
-      <w:pPr>
-        <w:ind w:left="360"/>
-      </w:pPr>
-    </w:p>
-    <w:p>
-      <w:pPr>
+        <w:t>(</w:t>
+      </w:r>
+      <w:proofErr w:type="spellStart"/>
+      <w:r>
         <w:rPr>
           <w:i/>
           <w:iCs/>
         </w:rPr>
-      </w:pPr>
+        <w:t>date_add</w:t>
+      </w:r>
+      <w:proofErr w:type="spellEnd"/>
       <w:r>
         <w:rPr>
           <w:i/>
           <w:iCs/>
         </w:rPr>
-        <w:t>select timestampdiff(second, &lt;&lt;start_date&gt;&gt;, &lt;&lt;end_date&gt;&gt;)</w:t>
-      </w:r>
-    </w:p>
-    <w:p/>
-    <w:p>
-      <w:pPr>
-        <w:pStyle w:val="ListParagraph"/>
-        <w:numPr>
-          <w:ilvl w:val="0"/>
-          <w:numId w:val="31"/>
-        </w:numPr>
-      </w:pPr>
-      <w:r>
-        <w:t>Format date – Date_format(“</w:t>
-      </w:r>
-      <w:r>
-        <w:t>"2017-06-15", "%M %d %Y")</w:t>
-      </w:r>
-      <w:r>
-        <w:t xml:space="preserve"> – Converts date to character in a specified format</w:t>
-      </w:r>
-    </w:p>
-    <w:p/>
-    <w:p>
-      <w:pPr>
+        <w:t>(</w:t>
+      </w:r>
+      <w:proofErr w:type="spellStart"/>
+      <w:r>
         <w:rPr>
           <w:i/>
           <w:iCs/>
         </w:rPr>
-      </w:pPr>
+        <w:t>current_date</w:t>
+      </w:r>
+      <w:proofErr w:type="spellEnd"/>
       <w:r>
         <w:rPr>
           <w:i/>
           <w:iCs/>
         </w:rPr>
-        <w:t>select date_format(current_date(), "%Y-%d-%m")</w:t>
-      </w:r>
-    </w:p>
-    <w:p/>
-    <w:p>
-      <w:pPr>
-        <w:pStyle w:val="ListParagraph"/>
-        <w:numPr>
-          <w:ilvl w:val="0"/>
-          <w:numId w:val="31"/>
-        </w:numPr>
-      </w:pPr>
-      <w:r>
-        <w:t>Convert a string of a specific format to date – str_to_date(“2025-04-04”,”%Y-%m-%d”)</w:t>
+        <w:t xml:space="preserve">(), interval 4 month), </w:t>
       </w:r>
     </w:p>
     <w:p>
@@ -12348,64 +13548,349 @@
           <w:iCs/>
         </w:rPr>
       </w:pPr>
-    </w:p>
-    <w:p>
-      <w:pPr>
+      <w:r>
         <w:rPr>
           <w:i/>
           <w:iCs/>
         </w:rPr>
-      </w:pPr>
+        <w:t xml:space="preserve">                </w:t>
+      </w:r>
+      <w:proofErr w:type="spellStart"/>
       <w:r>
         <w:rPr>
           <w:i/>
           <w:iCs/>
         </w:rPr>
-        <w:t>select str_to_date(</w:t>
-      </w:r>
-    </w:p>
-    <w:p>
-      <w:pPr>
+        <w:t>current_date</w:t>
+      </w:r>
+      <w:proofErr w:type="spellEnd"/>
+      <w:r>
         <w:rPr>
           <w:i/>
           <w:iCs/>
         </w:rPr>
-      </w:pPr>
-      <w:r>
+        <w:t>()) --only returns the different in days</w:t>
+      </w:r>
+    </w:p>
+    <w:p/>
+    <w:p>
+      <w:pPr>
+        <w:pStyle w:val="ListParagraph"/>
+        <w:numPr>
+          <w:ilvl w:val="0"/>
+          <w:numId w:val="31"/>
+        </w:numPr>
+      </w:pPr>
+      <w:proofErr w:type="spellStart"/>
+      <w:r>
+        <w:t>Timestampdiff</w:t>
+      </w:r>
+      <w:proofErr w:type="spellEnd"/>
+      <w:r>
+        <w:t xml:space="preserve"> – </w:t>
+      </w:r>
+      <w:proofErr w:type="spellStart"/>
+      <w:r>
+        <w:t>timestampdiff</w:t>
+      </w:r>
+      <w:proofErr w:type="spellEnd"/>
+      <w:r>
+        <w:t xml:space="preserve">(unit, </w:t>
+      </w:r>
+      <w:proofErr w:type="spellStart"/>
+      <w:r>
+        <w:t>start_date</w:t>
+      </w:r>
+      <w:proofErr w:type="spellEnd"/>
+      <w:r>
+        <w:t xml:space="preserve">, </w:t>
+      </w:r>
+      <w:proofErr w:type="spellStart"/>
+      <w:r>
+        <w:t>end_date</w:t>
+      </w:r>
+      <w:proofErr w:type="spellEnd"/>
+      <w:r>
+        <w:t>)</w:t>
+      </w:r>
+    </w:p>
+    <w:p>
+      <w:pPr>
+        <w:ind w:left="360"/>
+      </w:pPr>
+    </w:p>
+    <w:p>
+      <w:pPr>
         <w:rPr>
           <w:i/>
           <w:iCs/>
         </w:rPr>
-        <w:t xml:space="preserve">        date_format(current_date(), '%d-%m-%Y'), </w:t>
-      </w:r>
-    </w:p>
-    <w:p>
-      <w:pPr>
+      </w:pPr>
+      <w:r>
         <w:rPr>
           <w:i/>
           <w:iCs/>
         </w:rPr>
-      </w:pPr>
+        <w:t xml:space="preserve">select </w:t>
+      </w:r>
+      <w:proofErr w:type="spellStart"/>
       <w:r>
         <w:rPr>
           <w:i/>
           <w:iCs/>
         </w:rPr>
-        <w:t xml:space="preserve">        '%s'</w:t>
-      </w:r>
-    </w:p>
-    <w:p>
-      <w:pPr>
+        <w:t>timestampdiff</w:t>
+      </w:r>
+      <w:proofErr w:type="spellEnd"/>
+      <w:r>
         <w:rPr>
           <w:i/>
           <w:iCs/>
         </w:rPr>
-      </w:pPr>
+        <w:t>(second, &lt;&lt;</w:t>
+      </w:r>
+      <w:proofErr w:type="spellStart"/>
       <w:r>
         <w:rPr>
           <w:i/>
           <w:iCs/>
         </w:rPr>
+        <w:t>start_date</w:t>
+      </w:r>
+      <w:proofErr w:type="spellEnd"/>
+      <w:r>
+        <w:rPr>
+          <w:i/>
+          <w:iCs/>
+        </w:rPr>
+        <w:t>&gt;&gt;, &lt;&lt;</w:t>
+      </w:r>
+      <w:proofErr w:type="spellStart"/>
+      <w:r>
+        <w:rPr>
+          <w:i/>
+          <w:iCs/>
+        </w:rPr>
+        <w:t>end_date</w:t>
+      </w:r>
+      <w:proofErr w:type="spellEnd"/>
+      <w:r>
+        <w:rPr>
+          <w:i/>
+          <w:iCs/>
+        </w:rPr>
+        <w:t>&gt;&gt;)</w:t>
+      </w:r>
+    </w:p>
+    <w:p/>
+    <w:p>
+      <w:pPr>
+        <w:pStyle w:val="ListParagraph"/>
+        <w:numPr>
+          <w:ilvl w:val="0"/>
+          <w:numId w:val="31"/>
+        </w:numPr>
+      </w:pPr>
+      <w:r>
+        <w:t xml:space="preserve">Format date – </w:t>
+      </w:r>
+      <w:proofErr w:type="spellStart"/>
+      <w:r>
+        <w:t>Date_format</w:t>
+      </w:r>
+      <w:proofErr w:type="spellEnd"/>
+      <w:r>
+        <w:t>(“</w:t>
+      </w:r>
+      <w:r>
+        <w:t>"2017-06-15", "%M %d %Y")</w:t>
+      </w:r>
+      <w:r>
+        <w:t xml:space="preserve"> – Converts date to character in a specified format</w:t>
+      </w:r>
+    </w:p>
+    <w:p/>
+    <w:p>
+      <w:pPr>
+        <w:rPr>
+          <w:i/>
+          <w:iCs/>
+        </w:rPr>
+      </w:pPr>
+      <w:r>
+        <w:rPr>
+          <w:i/>
+          <w:iCs/>
+        </w:rPr>
+        <w:t xml:space="preserve">select </w:t>
+      </w:r>
+      <w:proofErr w:type="spellStart"/>
+      <w:r>
+        <w:rPr>
+          <w:i/>
+          <w:iCs/>
+        </w:rPr>
+        <w:t>date_format</w:t>
+      </w:r>
+      <w:proofErr w:type="spellEnd"/>
+      <w:r>
+        <w:rPr>
+          <w:i/>
+          <w:iCs/>
+        </w:rPr>
+        <w:t>(</w:t>
+      </w:r>
+      <w:proofErr w:type="spellStart"/>
+      <w:r>
+        <w:rPr>
+          <w:i/>
+          <w:iCs/>
+        </w:rPr>
+        <w:t>current_date</w:t>
+      </w:r>
+      <w:proofErr w:type="spellEnd"/>
+      <w:r>
+        <w:rPr>
+          <w:i/>
+          <w:iCs/>
+        </w:rPr>
+        <w:t>(), "%Y-%d-%m")</w:t>
+      </w:r>
+    </w:p>
+    <w:p/>
+    <w:p>
+      <w:pPr>
+        <w:pStyle w:val="ListParagraph"/>
+        <w:numPr>
+          <w:ilvl w:val="0"/>
+          <w:numId w:val="31"/>
+        </w:numPr>
+      </w:pPr>
+      <w:r>
+        <w:t xml:space="preserve">Convert a string of a specific format to date – </w:t>
+      </w:r>
+      <w:proofErr w:type="spellStart"/>
+      <w:r>
+        <w:t>str_to_date</w:t>
+      </w:r>
+      <w:proofErr w:type="spellEnd"/>
+      <w:r>
+        <w:t>(“2025-04-04”,”%Y-%m-%d”)</w:t>
+      </w:r>
+    </w:p>
+    <w:p>
+      <w:pPr>
+        <w:rPr>
+          <w:i/>
+          <w:iCs/>
+        </w:rPr>
+      </w:pPr>
+    </w:p>
+    <w:p>
+      <w:pPr>
+        <w:rPr>
+          <w:i/>
+          <w:iCs/>
+        </w:rPr>
+      </w:pPr>
+      <w:r>
+        <w:rPr>
+          <w:i/>
+          <w:iCs/>
+        </w:rPr>
+        <w:t xml:space="preserve">select </w:t>
+      </w:r>
+      <w:proofErr w:type="spellStart"/>
+      <w:r>
+        <w:rPr>
+          <w:i/>
+          <w:iCs/>
+        </w:rPr>
+        <w:t>str_to_date</w:t>
+      </w:r>
+      <w:proofErr w:type="spellEnd"/>
+      <w:r>
+        <w:rPr>
+          <w:i/>
+          <w:iCs/>
+        </w:rPr>
+        <w:t>(</w:t>
+      </w:r>
+    </w:p>
+    <w:p>
+      <w:pPr>
+        <w:rPr>
+          <w:i/>
+          <w:iCs/>
+        </w:rPr>
+      </w:pPr>
+      <w:r>
+        <w:rPr>
+          <w:i/>
+          <w:iCs/>
+        </w:rPr>
+        <w:t xml:space="preserve">        </w:t>
+      </w:r>
+      <w:proofErr w:type="spellStart"/>
+      <w:r>
+        <w:rPr>
+          <w:i/>
+          <w:iCs/>
+        </w:rPr>
+        <w:t>date_format</w:t>
+      </w:r>
+      <w:proofErr w:type="spellEnd"/>
+      <w:r>
+        <w:rPr>
+          <w:i/>
+          <w:iCs/>
+        </w:rPr>
+        <w:t>(</w:t>
+      </w:r>
+      <w:proofErr w:type="spellStart"/>
+      <w:r>
+        <w:rPr>
+          <w:i/>
+          <w:iCs/>
+        </w:rPr>
+        <w:t>current_date</w:t>
+      </w:r>
+      <w:proofErr w:type="spellEnd"/>
+      <w:r>
+        <w:rPr>
+          <w:i/>
+          <w:iCs/>
+        </w:rPr>
+        <w:t xml:space="preserve">(), '%d-%m-%Y'), </w:t>
+      </w:r>
+    </w:p>
+    <w:p>
+      <w:pPr>
+        <w:rPr>
+          <w:i/>
+          <w:iCs/>
+        </w:rPr>
+      </w:pPr>
+      <w:r>
+        <w:rPr>
+          <w:i/>
+          <w:iCs/>
+        </w:rPr>
+        <w:t xml:space="preserve">        '%s'</w:t>
+      </w:r>
+    </w:p>
+    <w:p>
+      <w:pPr>
+        <w:rPr>
+          <w:i/>
+          <w:iCs/>
+        </w:rPr>
+      </w:pPr>
+      <w:r>
+        <w:rPr>
+          <w:i/>
+          <w:iCs/>
+        </w:rPr>
         <w:t xml:space="preserve">    )</w:t>
       </w:r>
     </w:p>
@@ -12418,8 +13903,13 @@
           <w:numId w:val="31"/>
         </w:numPr>
       </w:pPr>
-      <w:r>
-        <w:t>Order_timestamp between “2024-01-01” and “2024-05-04”</w:t>
+      <w:proofErr w:type="spellStart"/>
+      <w:r>
+        <w:t>Order_timestamp</w:t>
+      </w:r>
+      <w:proofErr w:type="spellEnd"/>
+      <w:r>
+        <w:t xml:space="preserve"> between “2024-01-01” and “2024-05-04”</w:t>
       </w:r>
     </w:p>
     <w:p>
@@ -12567,7 +14057,15 @@
         </w:numPr>
       </w:pPr>
       <w:r>
-        <w:t>%i: Minutes (00-59)</w:t>
+        <w:t>%</w:t>
+      </w:r>
+      <w:proofErr w:type="spellStart"/>
+      <w:r>
+        <w:t>i</w:t>
+      </w:r>
+      <w:proofErr w:type="spellEnd"/>
+      <w:r>
+        <w:t>: Minutes (00-59)</w:t>
       </w:r>
     </w:p>
     <w:p>
@@ -12640,8 +14138,21 @@
           <w:numId w:val="32"/>
         </w:numPr>
       </w:pPr>
-      <w:r>
-        <w:t>Ltrim/rtrim – to remove zeroes from both the side</w:t>
+      <w:proofErr w:type="spellStart"/>
+      <w:r>
+        <w:t>Ltrim</w:t>
+      </w:r>
+      <w:proofErr w:type="spellEnd"/>
+      <w:r>
+        <w:t>/</w:t>
+      </w:r>
+      <w:proofErr w:type="spellStart"/>
+      <w:r>
+        <w:t>rtrim</w:t>
+      </w:r>
+      <w:proofErr w:type="spellEnd"/>
+      <w:r>
+        <w:t xml:space="preserve"> – to remove zeroes from both the side</w:t>
       </w:r>
     </w:p>
     <w:p>
@@ -12664,8 +14175,21 @@
           <w:numId w:val="32"/>
         </w:numPr>
       </w:pPr>
-      <w:r>
-        <w:t xml:space="preserve">Substr – substr (string, start index, </w:t>
+      <w:proofErr w:type="spellStart"/>
+      <w:r>
+        <w:t>Substr</w:t>
+      </w:r>
+      <w:proofErr w:type="spellEnd"/>
+      <w:r>
+        <w:t xml:space="preserve"> – </w:t>
+      </w:r>
+      <w:proofErr w:type="spellStart"/>
+      <w:r>
+        <w:t>substr</w:t>
+      </w:r>
+      <w:proofErr w:type="spellEnd"/>
+      <w:r>
+        <w:t xml:space="preserve"> (string, start index, </w:t>
       </w:r>
       <w:r>
         <w:t>number of characters</w:t>
@@ -12688,8 +14212,13 @@
           <w:numId w:val="32"/>
         </w:numPr>
       </w:pPr>
-      <w:r>
-        <w:t>Strcmp (first text, other text)</w:t>
+      <w:proofErr w:type="spellStart"/>
+      <w:r>
+        <w:t>Strcmp</w:t>
+      </w:r>
+      <w:proofErr w:type="spellEnd"/>
+      <w:r>
+        <w:t xml:space="preserve"> (first text, other text)</w:t>
       </w:r>
     </w:p>
     <w:p>
@@ -12718,8 +14247,21 @@
           <w:numId w:val="32"/>
         </w:numPr>
       </w:pPr>
-      <w:r>
-        <w:t xml:space="preserve">Instr – Instr (string, substring) </w:t>
+      <w:proofErr w:type="spellStart"/>
+      <w:r>
+        <w:t>Instr</w:t>
+      </w:r>
+      <w:proofErr w:type="spellEnd"/>
+      <w:r>
+        <w:t xml:space="preserve"> – </w:t>
+      </w:r>
+      <w:proofErr w:type="spellStart"/>
+      <w:r>
+        <w:t>Instr</w:t>
+      </w:r>
+      <w:proofErr w:type="spellEnd"/>
+      <w:r>
+        <w:t xml:space="preserve"> (string, substring) </w:t>
       </w:r>
     </w:p>
     <w:p/>
@@ -12758,7 +14300,14 @@
       </w:r>
       <w:r>
         <w:tab/>
-        <w:t>student_id varchar(10),</w:t>
+      </w:r>
+      <w:proofErr w:type="spellStart"/>
+      <w:r>
+        <w:t>student_id</w:t>
+      </w:r>
+      <w:proofErr w:type="spellEnd"/>
+      <w:r>
+        <w:t xml:space="preserve"> varchar(10),</w:t>
       </w:r>
     </w:p>
     <w:p>
@@ -12767,7 +14316,22 @@
       </w:r>
       <w:r>
         <w:tab/>
-        <w:t>class_id varchar(10) primary key, --constraints primary key(class_id)</w:t>
+      </w:r>
+      <w:proofErr w:type="spellStart"/>
+      <w:r>
+        <w:t>class_id</w:t>
+      </w:r>
+      <w:proofErr w:type="spellEnd"/>
+      <w:r>
+        <w:t xml:space="preserve"> varchar(10) primary key, --constraints primary key(</w:t>
+      </w:r>
+      <w:proofErr w:type="spellStart"/>
+      <w:r>
+        <w:t>class_id</w:t>
+      </w:r>
+      <w:proofErr w:type="spellEnd"/>
+      <w:r>
+        <w:t>)</w:t>
       </w:r>
     </w:p>
     <w:p>
@@ -12785,7 +14349,15 @@
       </w:r>
       <w:r>
         <w:tab/>
-        <w:t xml:space="preserve">constraint unique(student_id), </w:t>
+        <w:t>constraint unique(</w:t>
+      </w:r>
+      <w:proofErr w:type="spellStart"/>
+      <w:r>
+        <w:t>student_id</w:t>
+      </w:r>
+      <w:proofErr w:type="spellEnd"/>
+      <w:r>
+        <w:t xml:space="preserve">), </w:t>
       </w:r>
     </w:p>
     <w:p>
@@ -12839,7 +14411,14 @@
     <w:p>
       <w:r>
         <w:tab/>
-        <w:t xml:space="preserve">teacher_id varchar(4) primary key, </w:t>
+      </w:r>
+      <w:proofErr w:type="spellStart"/>
+      <w:r>
+        <w:t>teacher_id</w:t>
+      </w:r>
+      <w:proofErr w:type="spellEnd"/>
+      <w:r>
+        <w:t xml:space="preserve"> varchar(4) primary key, </w:t>
       </w:r>
     </w:p>
     <w:p>
@@ -12848,7 +14427,14 @@
       </w:r>
       <w:r>
         <w:tab/>
-        <w:t xml:space="preserve">student_id varchar(10), </w:t>
+      </w:r>
+      <w:proofErr w:type="spellStart"/>
+      <w:r>
+        <w:t>student_id</w:t>
+      </w:r>
+      <w:proofErr w:type="spellEnd"/>
+      <w:r>
+        <w:t xml:space="preserve"> varchar(10), </w:t>
       </w:r>
     </w:p>
     <w:p>
@@ -12857,7 +14443,23 @@
       </w:r>
       <w:r>
         <w:tab/>
-        <w:t>constraint foreign key (student_id) references students(student_id)</w:t>
+        <w:t>constraint foreign key (</w:t>
+      </w:r>
+      <w:proofErr w:type="spellStart"/>
+      <w:r>
+        <w:t>student_id</w:t>
+      </w:r>
+      <w:proofErr w:type="spellEnd"/>
+      <w:r>
+        <w:t>) references students(</w:t>
+      </w:r>
+      <w:proofErr w:type="spellStart"/>
+      <w:r>
+        <w:t>student_id</w:t>
+      </w:r>
+      <w:proofErr w:type="spellEnd"/>
+      <w:r>
+        <w:t>)</w:t>
       </w:r>
     </w:p>
     <w:p>
@@ -12888,7 +14490,14 @@
     <w:p>
       <w:r>
         <w:tab/>
-        <w:t xml:space="preserve">school_name varchar(20), </w:t>
+      </w:r>
+      <w:proofErr w:type="spellStart"/>
+      <w:r>
+        <w:t>school_name</w:t>
+      </w:r>
+      <w:proofErr w:type="spellEnd"/>
+      <w:r>
+        <w:t xml:space="preserve"> varchar(20), </w:t>
       </w:r>
     </w:p>
     <w:p>
@@ -12897,7 +14506,22 @@
       </w:r>
       <w:r>
         <w:tab/>
-        <w:t>s_no int primary key auto_increment);</w:t>
+      </w:r>
+      <w:proofErr w:type="spellStart"/>
+      <w:r>
+        <w:t>s_no</w:t>
+      </w:r>
+      <w:proofErr w:type="spellEnd"/>
+      <w:r>
+        <w:t xml:space="preserve"> int primary key </w:t>
+      </w:r>
+      <w:proofErr w:type="spellStart"/>
+      <w:r>
+        <w:t>auto_increment</w:t>
+      </w:r>
+      <w:proofErr w:type="spellEnd"/>
+      <w:r>
+        <w:t>);</w:t>
       </w:r>
     </w:p>
     <w:p>
@@ -13003,7 +14627,15 @@
         </w:numPr>
       </w:pPr>
       <w:r>
-        <w:t>There is no partial dependency on the primary key. If Primary key is a composite key which consists on (Student Id, Course Id) and there is a columns studentScore which depends only on Student Id, then there is a partial dependency it violates the rules</w:t>
+        <w:t xml:space="preserve">There is no partial dependency on the primary key. If Primary key is a composite key which consists on (Student Id, Course Id) and there is a columns </w:t>
+      </w:r>
+      <w:proofErr w:type="spellStart"/>
+      <w:r>
+        <w:t>studentScore</w:t>
+      </w:r>
+      <w:proofErr w:type="spellEnd"/>
+      <w:r>
+        <w:t xml:space="preserve"> which depends only on Student Id, then there is a partial dependency it violates the rules</w:t>
       </w:r>
     </w:p>
     <w:p>
@@ -13315,7 +14947,7 @@
       <w:r>
         <w:t xml:space="preserve">Video - </w:t>
       </w:r>
-      <w:hyperlink r:id="rId43" w:history="1">
+      <w:hyperlink r:id="rId47" w:history="1">
         <w:r>
           <w:rPr>
             <w:rStyle w:val="Hyperlink"/>
@@ -13388,8 +15020,13 @@
     <w:p>
       <w:r>
         <w:lastRenderedPageBreak/>
-        <w:t>Different types of index and types of nomalisations</w:t>
-      </w:r>
+        <w:t xml:space="preserve">Different types of index and types of </w:t>
+      </w:r>
+      <w:proofErr w:type="spellStart"/>
+      <w:r>
+        <w:t>nomalisations</w:t>
+      </w:r>
+      <w:proofErr w:type="spellEnd"/>
     </w:p>
     <w:p/>
     <w:p>
@@ -13398,7 +15035,7 @@
       </w:r>
     </w:p>
     <w:p>
-      <w:hyperlink r:id="rId44" w:history="1">
+      <w:hyperlink r:id="rId48" w:history="1">
         <w:r>
           <w:rPr>
             <w:rStyle w:val="Hyperlink"/>
@@ -13408,7 +15045,7 @@
       </w:hyperlink>
     </w:p>
     <w:p>
-      <w:hyperlink r:id="rId45" w:history="1">
+      <w:hyperlink r:id="rId49" w:history="1">
         <w:r>
           <w:rPr>
             <w:rStyle w:val="Hyperlink"/>
@@ -13418,7 +15055,7 @@
       </w:hyperlink>
     </w:p>
     <w:p>
-      <w:hyperlink r:id="rId46" w:history="1">
+      <w:hyperlink r:id="rId50" w:history="1">
         <w:r>
           <w:rPr>
             <w:rStyle w:val="Hyperlink"/>
@@ -13428,7 +15065,7 @@
       </w:hyperlink>
     </w:p>
     <w:p>
-      <w:hyperlink r:id="rId47" w:history="1">
+      <w:hyperlink r:id="rId51" w:history="1">
         <w:r>
           <w:rPr>
             <w:rStyle w:val="Hyperlink"/>
@@ -13438,7 +15075,7 @@
       </w:hyperlink>
     </w:p>
     <w:p>
-      <w:hyperlink r:id="rId48" w:history="1">
+      <w:hyperlink r:id="rId52" w:history="1">
         <w:r>
           <w:rPr>
             <w:rStyle w:val="Hyperlink"/>
@@ -13454,7 +15091,7 @@
       </w:r>
     </w:p>
     <w:p>
-      <w:hyperlink r:id="rId49" w:history="1">
+      <w:hyperlink r:id="rId53" w:history="1">
         <w:r>
           <w:rPr>
             <w:rStyle w:val="Hyperlink"/>
@@ -13470,17 +15107,30 @@
     </w:p>
     <w:p>
       <w:r>
-        <w:t>Frequentist Baysian Approach</w:t>
+        <w:t xml:space="preserve">Frequentist </w:t>
+      </w:r>
+      <w:proofErr w:type="spellStart"/>
+      <w:r>
+        <w:t>Baysian</w:t>
+      </w:r>
+      <w:proofErr w:type="spellEnd"/>
+      <w:r>
+        <w:t xml:space="preserve"> Approach</w:t>
       </w:r>
     </w:p>
     <w:p/>
     <w:p>
-      <w:r>
-        <w:t>Baysian Models and Analysis</w:t>
-      </w:r>
-    </w:p>
-    <w:p>
-      <w:hyperlink r:id="rId50" w:history="1">
+      <w:proofErr w:type="spellStart"/>
+      <w:r>
+        <w:t>Baysian</w:t>
+      </w:r>
+      <w:proofErr w:type="spellEnd"/>
+      <w:r>
+        <w:t xml:space="preserve"> Models and Analysis</w:t>
+      </w:r>
+    </w:p>
+    <w:p>
+      <w:hyperlink r:id="rId54" w:history="1">
         <w:r>
           <w:rPr>
             <w:rStyle w:val="Hyperlink"/>
@@ -13669,7 +15319,7 @@
                     </pic:cNvPicPr>
                   </pic:nvPicPr>
                   <pic:blipFill>
-                    <a:blip r:embed="rId51">
+                    <a:blip r:embed="rId55">
                       <a:extLst>
                         <a:ext uri="{28A0092B-C50C-407E-A947-70E740481C1C}">
                           <a14:useLocalDpi xmlns:a14="http://schemas.microsoft.com/office/drawing/2010/main" val="0"/>

</xml_diff>